<commit_message>
rapport ESME: audit sources, biblio 32 refs avec liens verifies, Morioka/Kuruppu completes, LaBraM confirme article, DOCX/PDF 55 p.
Co-authored-by: Cursor <cursoragent@cursor.com>
</commit_message>
<xml_diff>
--- a/docs/rapport-esme-inge3/Lacombe_Maxime_Rapport_Stage_ESME_INGE3.docx
+++ b/docs/rapport-esme-inge3/Lacombe_Maxime_Rapport_Stage_ESME_INGE3.docx
@@ -310,7 +310,7 @@
     </w:p>
     <w:p>
       <w:r>
-        <w:pict w14:anchorId="7784E753">
+        <w:pict w14:anchorId="402A6852">
           <v:rect id="_x0000_i1025" style="width:0;height:1.5pt" o:hralign="center" o:hrstd="t" o:hr="t"/>
         </w:pict>
       </w:r>
@@ -475,7 +475,7 @@
     </w:p>
     <w:p>
       <w:r>
-        <w:pict w14:anchorId="7784E754">
+        <w:pict w14:anchorId="402A6853">
           <v:rect id="_x0000_i1026" style="width:0;height:1.5pt" o:hralign="center" o:hrstd="t" o:hr="t"/>
         </w:pict>
       </w:r>
@@ -550,7 +550,7 @@
       <w:r>
         <w:fldChar w:fldCharType="separate"/>
       </w:r>
-      <w:hyperlink w:anchor="_Toc239949762" w:history="1">
+      <w:hyperlink w:anchor="_Toc239952073" w:history="1">
         <w:r>
           <w:rPr>
             <w:rStyle w:val="Lienhypertexte"/>
@@ -577,7 +577,7 @@
             <w:noProof/>
             <w:webHidden/>
           </w:rPr>
-          <w:instrText xml:space="preserve"> PAGEREF _Toc239949762 \h </w:instrText>
+          <w:instrText xml:space="preserve"> PAGEREF _Toc239952073 \h </w:instrText>
         </w:r>
         <w:r>
           <w:rPr>
@@ -623,7 +623,7 @@
           <w14:ligatures w14:val="standardContextual"/>
         </w:rPr>
       </w:pPr>
-      <w:hyperlink w:anchor="_Toc239949763" w:history="1">
+      <w:hyperlink w:anchor="_Toc239952074" w:history="1">
         <w:r>
           <w:rPr>
             <w:rStyle w:val="Lienhypertexte"/>
@@ -650,7 +650,7 @@
             <w:noProof/>
             <w:webHidden/>
           </w:rPr>
-          <w:instrText xml:space="preserve"> PAGEREF _Toc239949763 \h </w:instrText>
+          <w:instrText xml:space="preserve"> PAGEREF _Toc239952074 \h </w:instrText>
         </w:r>
         <w:r>
           <w:rPr>
@@ -696,7 +696,7 @@
           <w14:ligatures w14:val="standardContextual"/>
         </w:rPr>
       </w:pPr>
-      <w:hyperlink w:anchor="_Toc239949764" w:history="1">
+      <w:hyperlink w:anchor="_Toc239952075" w:history="1">
         <w:r>
           <w:rPr>
             <w:rStyle w:val="Lienhypertexte"/>
@@ -723,7 +723,7 @@
             <w:noProof/>
             <w:webHidden/>
           </w:rPr>
-          <w:instrText xml:space="preserve"> PAGEREF _Toc239949764 \h </w:instrText>
+          <w:instrText xml:space="preserve"> PAGEREF _Toc239952075 \h </w:instrText>
         </w:r>
         <w:r>
           <w:rPr>
@@ -769,7 +769,7 @@
           <w14:ligatures w14:val="standardContextual"/>
         </w:rPr>
       </w:pPr>
-      <w:hyperlink w:anchor="_Toc239949765" w:history="1">
+      <w:hyperlink w:anchor="_Toc239952076" w:history="1">
         <w:r>
           <w:rPr>
             <w:rStyle w:val="Lienhypertexte"/>
@@ -796,7 +796,7 @@
             <w:noProof/>
             <w:webHidden/>
           </w:rPr>
-          <w:instrText xml:space="preserve"> PAGEREF _Toc239949765 \h </w:instrText>
+          <w:instrText xml:space="preserve"> PAGEREF _Toc239952076 \h </w:instrText>
         </w:r>
         <w:r>
           <w:rPr>
@@ -842,7 +842,7 @@
           <w14:ligatures w14:val="standardContextual"/>
         </w:rPr>
       </w:pPr>
-      <w:hyperlink w:anchor="_Toc239949766" w:history="1">
+      <w:hyperlink w:anchor="_Toc239952077" w:history="1">
         <w:r>
           <w:rPr>
             <w:rStyle w:val="Lienhypertexte"/>
@@ -869,7 +869,7 @@
             <w:noProof/>
             <w:webHidden/>
           </w:rPr>
-          <w:instrText xml:space="preserve"> PAGEREF _Toc239949766 \h </w:instrText>
+          <w:instrText xml:space="preserve"> PAGEREF _Toc239952077 \h </w:instrText>
         </w:r>
         <w:r>
           <w:rPr>
@@ -915,7 +915,7 @@
           <w14:ligatures w14:val="standardContextual"/>
         </w:rPr>
       </w:pPr>
-      <w:hyperlink w:anchor="_Toc239949767" w:history="1">
+      <w:hyperlink w:anchor="_Toc239952078" w:history="1">
         <w:r>
           <w:rPr>
             <w:rStyle w:val="Lienhypertexte"/>
@@ -942,7 +942,7 @@
             <w:noProof/>
             <w:webHidden/>
           </w:rPr>
-          <w:instrText xml:space="preserve"> PAGEREF _Toc239949767 \h </w:instrText>
+          <w:instrText xml:space="preserve"> PAGEREF _Toc239952078 \h </w:instrText>
         </w:r>
         <w:r>
           <w:rPr>
@@ -988,7 +988,7 @@
           <w14:ligatures w14:val="standardContextual"/>
         </w:rPr>
       </w:pPr>
-      <w:hyperlink w:anchor="_Toc239949768" w:history="1">
+      <w:hyperlink w:anchor="_Toc239952079" w:history="1">
         <w:r>
           <w:rPr>
             <w:rStyle w:val="Lienhypertexte"/>
@@ -1015,7 +1015,7 @@
             <w:noProof/>
             <w:webHidden/>
           </w:rPr>
-          <w:instrText xml:space="preserve"> PAGEREF _Toc239949768 \h </w:instrText>
+          <w:instrText xml:space="preserve"> PAGEREF _Toc239952079 \h </w:instrText>
         </w:r>
         <w:r>
           <w:rPr>
@@ -1061,7 +1061,7 @@
           <w14:ligatures w14:val="standardContextual"/>
         </w:rPr>
       </w:pPr>
-      <w:hyperlink w:anchor="_Toc239949769" w:history="1">
+      <w:hyperlink w:anchor="_Toc239952080" w:history="1">
         <w:r>
           <w:rPr>
             <w:rStyle w:val="Lienhypertexte"/>
@@ -1088,7 +1088,7 @@
             <w:noProof/>
             <w:webHidden/>
           </w:rPr>
-          <w:instrText xml:space="preserve"> PAGEREF _Toc239949769 \h </w:instrText>
+          <w:instrText xml:space="preserve"> PAGEREF _Toc239952080 \h </w:instrText>
         </w:r>
         <w:r>
           <w:rPr>
@@ -1134,7 +1134,7 @@
           <w14:ligatures w14:val="standardContextual"/>
         </w:rPr>
       </w:pPr>
-      <w:hyperlink w:anchor="_Toc239949770" w:history="1">
+      <w:hyperlink w:anchor="_Toc239952081" w:history="1">
         <w:r>
           <w:rPr>
             <w:rStyle w:val="Lienhypertexte"/>
@@ -1161,7 +1161,7 @@
             <w:noProof/>
             <w:webHidden/>
           </w:rPr>
-          <w:instrText xml:space="preserve"> PAGEREF _Toc239949770 \h </w:instrText>
+          <w:instrText xml:space="preserve"> PAGEREF _Toc239952081 \h </w:instrText>
         </w:r>
         <w:r>
           <w:rPr>
@@ -1207,7 +1207,7 @@
           <w14:ligatures w14:val="standardContextual"/>
         </w:rPr>
       </w:pPr>
-      <w:hyperlink w:anchor="_Toc239949771" w:history="1">
+      <w:hyperlink w:anchor="_Toc239952082" w:history="1">
         <w:r>
           <w:rPr>
             <w:rStyle w:val="Lienhypertexte"/>
@@ -1234,7 +1234,7 @@
             <w:noProof/>
             <w:webHidden/>
           </w:rPr>
-          <w:instrText xml:space="preserve"> PAGEREF _Toc239949771 \h </w:instrText>
+          <w:instrText xml:space="preserve"> PAGEREF _Toc239952082 \h </w:instrText>
         </w:r>
         <w:r>
           <w:rPr>
@@ -1254,7 +1254,7 @@
             <w:noProof/>
             <w:webHidden/>
           </w:rPr>
-          <w:t>49</w:t>
+          <w:t>50</w:t>
         </w:r>
         <w:r>
           <w:rPr>
@@ -1280,7 +1280,7 @@
         <w:pStyle w:val="Titre1"/>
       </w:pPr>
       <w:bookmarkStart w:id="3" w:name="introduction-et-problématique"/>
-      <w:bookmarkStart w:id="4" w:name="_Toc239949762"/>
+      <w:bookmarkStart w:id="4" w:name="_Toc239952073"/>
       <w:bookmarkEnd w:id="2"/>
       <w:r>
         <w:lastRenderedPageBreak/>
@@ -2165,7 +2165,7 @@
         <w:pStyle w:val="Titre1"/>
       </w:pPr>
       <w:bookmarkStart w:id="10" w:name="Xc9274099040334eec1ec06880d2f72b2608996c"/>
-      <w:bookmarkStart w:id="11" w:name="_Toc239949763"/>
+      <w:bookmarkStart w:id="11" w:name="_Toc239952074"/>
       <w:bookmarkEnd w:id="9"/>
       <w:bookmarkEnd w:id="3"/>
       <w:r>
@@ -2538,7 +2538,17 @@
         <w:t>Morioka et al., 2014</w:t>
       </w:r>
       <w:r>
-        <w:t>. Le PDF complet n’est pas nécessairement sur ce PC ; je n’invente pas les détails du papier original au-delà de ce que le labo utilise opérationnellement (fenêtre d’attention 8 s, deux classes, 43 sujets).</w:t>
+        <w:t xml:space="preserve"> (</w:t>
+      </w:r>
+      <w:r>
+        <w:rPr>
+          <w:i/>
+          <w:iCs/>
+        </w:rPr>
+        <w:t>NeuroImage</w:t>
+      </w:r>
+      <w:r>
+        <w:t>, groupe du professeur Ishii). Je n’ai pas étudié cet article en détail et je n’extrapole pas sur le protocole original au-delà de ce que le labo utilise opérationnellement (fenêtre d’attention 8 s, deux classes, 43 sujets).</w:t>
       </w:r>
     </w:p>
     <w:p>
@@ -2598,7 +2608,7 @@
           <w:noProof/>
         </w:rPr>
         <w:drawing>
-          <wp:inline distT="0" distB="0" distL="0" distR="0" wp14:anchorId="7784E755" wp14:editId="7784E756">
+          <wp:inline distT="0" distB="0" distL="0" distR="0" wp14:anchorId="402A6854" wp14:editId="402A6855">
             <wp:extent cx="5334000" cy="3130020"/>
             <wp:effectExtent l="0" t="0" r="0" b="0"/>
             <wp:docPr id="22" name="Picture" descr="Vue d’ensemble ST-EEGFormer (papier Yang et al.)"/>
@@ -2790,7 +2800,11 @@
               <w:pStyle w:val="Compact"/>
             </w:pPr>
             <w:r>
-              <w:t>répartition du 28 avril 2026 : Liz adapte POYO/CaPOYO vers l’EEG, j’évalue un modèle de fondation EEG, Cuong explore le jeu du laboratoire ; réorientation d’août vers le rapprochement EEG / imagerie calcique</w:t>
+              <w:t xml:space="preserve">répartition du 28 avril 2026 : Liz adapte POYO/CaPOYO vers l’EEG, j’évalue un modèle de fondation EEG, Cuong explore le jeu du laboratoire ; réorientation d’août vers le rapprochement EEG / imagerie </w:t>
+            </w:r>
+            <w:r>
+              <w:lastRenderedPageBreak/>
+              <w:t>calcique</w:t>
             </w:r>
           </w:p>
         </w:tc>
@@ -3233,11 +3247,8 @@
               <w:pStyle w:val="Compact"/>
             </w:pPr>
             <w:r>
-              <w:t xml:space="preserve">LOSO 41 plis (50 + 30 epochs </w:t>
-            </w:r>
-            <w:r>
               <w:lastRenderedPageBreak/>
-              <w:t>par pli)</w:t>
+              <w:t>LOSO 41 plis (50 + 30 epochs par pli)</w:t>
             </w:r>
           </w:p>
         </w:tc>
@@ -3250,7 +3261,6 @@
               <w:pStyle w:val="Compact"/>
             </w:pPr>
             <w:r>
-              <w:lastRenderedPageBreak/>
               <w:t xml:space="preserve">environ </w:t>
             </w:r>
             <w:r>
@@ -3261,11 +3271,7 @@
               <w:t>un pli par jour</w:t>
             </w:r>
             <w:r>
-              <w:t xml:space="preserve"> sur GPU </w:t>
-            </w:r>
-            <w:r>
-              <w:lastRenderedPageBreak/>
-              <w:t>dédiée, soit plusieurs semaines de calcul continu (juillet → 2 septembre)</w:t>
+              <w:t xml:space="preserve"> sur GPU dédiée, soit plusieurs semaines de calcul continu (juillet → 2 septembre)</w:t>
             </w:r>
           </w:p>
         </w:tc>
@@ -3278,12 +3284,7 @@
               <w:pStyle w:val="Compact"/>
             </w:pPr>
             <w:r>
-              <w:lastRenderedPageBreak/>
-              <w:t xml:space="preserve">53,55 % ± 3,20 % : la mesure du </w:t>
-            </w:r>
-            <w:r>
-              <w:lastRenderedPageBreak/>
-              <w:t>transfert inter-sujets</w:t>
+              <w:t>53,55 % ± 3,20 % : la mesure du transfert inter-sujets</w:t>
             </w:r>
           </w:p>
         </w:tc>
@@ -3298,7 +3299,6 @@
               <w:pStyle w:val="Compact"/>
             </w:pPr>
             <w:r>
-              <w:lastRenderedPageBreak/>
               <w:t>Sonde linéaire, encodeur gelé (2 050 paramètres entraînables)</w:t>
             </w:r>
           </w:p>
@@ -3384,7 +3384,10 @@
         <w:t>COMPLETED</w:t>
       </w:r>
       <w:r>
-        <w:t xml:space="preserve"> est écrit à la fin de chaque pli LOSO ; une relance après expiration de la limite de temps Slurm ne recalcule pas les plis déjà terminés. Sur un travail de 43 plis, ce mécanisme évite de reproduire des semaines de calcul.</w:t>
+        <w:t xml:space="preserve"> </w:t>
+      </w:r>
+      <w:r>
+        <w:t>est écrit à la fin de chaque pli LOSO ; une relance après expiration de la limite de temps Slurm ne recalcule pas les plis déjà terminés. Sur un travail de 43 plis, ce mécanisme évite de reproduire des semaines de calcul.</w:t>
       </w:r>
     </w:p>
     <w:p>
@@ -3403,10 +3406,7 @@
         <w:t>Tests de fumée avant runs longs.</w:t>
       </w:r>
       <w:r>
-        <w:t xml:space="preserve"> </w:t>
-      </w:r>
-      <w:r>
-        <w:t>Le travail de validation Slurm a été lancé sur une seule epoch puis annulé dès la chaîne validée, précisément pour ne pas consommer une quinzaine d’heures de GPU sans nouvelle information.</w:t>
+        <w:t xml:space="preserve"> Le travail de validation Slurm a été lancé sur une seule epoch puis annulé dès la chaîne validée, précisément pour ne pas consommer une quinzaine d’heures de GPU sans nouvelle information.</w:t>
       </w:r>
     </w:p>
     <w:p>
@@ -3650,7 +3650,7 @@
         <w:pStyle w:val="Titre1"/>
       </w:pPr>
       <w:bookmarkStart w:id="24" w:name="X3ab7f53bbe44a188e94b6e4d4676efaffd3943b"/>
-      <w:bookmarkStart w:id="25" w:name="_Toc239949764"/>
+      <w:bookmarkStart w:id="25" w:name="_Toc239952075"/>
       <w:bookmarkEnd w:id="23"/>
       <w:bookmarkEnd w:id="17"/>
       <w:bookmarkEnd w:id="10"/>
@@ -4680,41 +4680,44 @@
         <w:t>EEG Foundation Models: A Critical Review of Current Progress and Future Directions</w:t>
       </w:r>
       <w:r>
-        <w:t xml:space="preserve"> remise par le professeur Ishii. </w:t>
-      </w:r>
-      <w:r>
-        <w:rPr>
-          <w:b/>
-          <w:bCs/>
-        </w:rPr>
-        <w:t>Remarque de traçabilité :</w:t>
-      </w:r>
-      <w:r>
-        <w:t xml:space="preserve"> seul le support de présentation que j’ai construit est présent sur la machine de rédaction ; le PDF de la revue lui-même ne s’y trouve pas. Je ne cite donc de cette revue que ce que mon propre support atteste, sans lui attribuer de chiffres.</w:t>
-      </w:r>
-    </w:p>
-    <w:p>
-      <w:pPr>
-        <w:pStyle w:val="Corpsdetexte"/>
-      </w:pPr>
-      <w:r>
-        <w:t xml:space="preserve">Un point de vocabulaire mérite d’être isolé, car il a occupé deux réunions du laboratoire (6 et 13 août 2026) : </w:t>
-      </w:r>
-      <w:r>
-        <w:rPr>
-          <w:b/>
-          <w:bCs/>
-        </w:rPr>
-        <w:t>« tokenisation » ne désigne pas la même opération selon les modèles.</w:t>
-      </w:r>
-      <w:r>
-        <w:t xml:space="preserve"> Dans LaBraM, chaque morceau de signal est remplacé par l’indice d’un mot dans un dictionnaire appris (</w:t>
+        <w:t xml:space="preserve"> remise par le professeur Ishii (Kuruppu, Wagh, Kremen &amp; Varatharajah, </w:t>
       </w:r>
       <w:r>
         <w:rPr>
           <w:i/>
           <w:iCs/>
         </w:rPr>
+        <w:t>Journal of Neural Engineering</w:t>
+      </w:r>
+      <w:r>
+        <w:t>, 2026 ; prépublication arXiv de juillet 2025). Cette revue compare dix modèles de fondation EEG précoces selon trois axes — représentation de l’entrée, objectif auto-supervisé, stratégie d’évaluation — et conclut que la plupart reposent sur un transformeur et sur la reconstruction de séquences temporelles masquées, tandis que l</w:t>
+      </w:r>
+      <w:r>
+        <w:t>es évaluations restent hétérogènes et trop limitées pour juger de leur utilité « prêt-à-l’emploi ». C’est exactement la question que pose le papier support, et celle que ce stage instancie sur un jeu de données de laboratoire.</w:t>
+      </w:r>
+    </w:p>
+    <w:p>
+      <w:pPr>
+        <w:pStyle w:val="Corpsdetexte"/>
+      </w:pPr>
+      <w:r>
+        <w:t xml:space="preserve">Un point de vocabulaire mérite d’être isolé, car il a occupé deux réunions du laboratoire (6 et 13 août 2026) : </w:t>
+      </w:r>
+      <w:r>
+        <w:rPr>
+          <w:b/>
+          <w:bCs/>
+        </w:rPr>
+        <w:t>« tokenisation » ne désigne pas la même opération selon les modèles.</w:t>
+      </w:r>
+      <w:r>
+        <w:t xml:space="preserve"> Dans LaBraM, chaque morceau de signal est remplacé par l’indice d’un mot dans un dictionnaire appris (</w:t>
+      </w:r>
+      <w:r>
+        <w:rPr>
+          <w:i/>
+          <w:iCs/>
+        </w:rPr>
         <w:t>codebook</w:t>
       </w:r>
       <w:r>
@@ -4913,6 +4916,7 @@
           <w:b/>
           <w:bCs/>
         </w:rPr>
+        <w:lastRenderedPageBreak/>
         <w:t>Étape 1 — Le découpage (</w:t>
       </w:r>
       <w:r>
@@ -4977,7 +4981,6 @@
           <w:i/>
           <w:iCs/>
         </w:rPr>
-        <w:lastRenderedPageBreak/>
         <w:t>patch</w:t>
       </w:r>
       <w:r>
@@ -5666,10 +5669,7 @@
         <w:t>302 millions de paramètres</w:t>
       </w:r>
       <w:r>
-        <w:t xml:space="preserve"> </w:t>
-      </w:r>
-      <w:r>
-        <w:t>(valeur relevée dans nos journaux d’exécution). Le coût de l’attention étant quadratique en nombre de tokens, la longueur 4 097 est ce qui dicte la mémoire GPU (§ 4.5).</w:t>
+        <w:t xml:space="preserve"> (valeur relevée dans nos journaux d’exécution). Le coût de l’attention étant quadratique en nombre de tokens, la longueur 4 097 est ce qui dicte la mémoire GPU (§ 4.5).</w:t>
       </w:r>
     </w:p>
     <w:p>
@@ -5798,6 +5798,7 @@
           <w:b/>
           <w:bCs/>
         </w:rPr>
+        <w:lastRenderedPageBreak/>
         <w:t>Réinsérer</w:t>
       </w:r>
       <w:r>
@@ -5901,7 +5902,6 @@
           <w:b/>
           <w:bCs/>
         </w:rPr>
-        <w:lastRenderedPageBreak/>
         <w:t>Prédire</w:t>
       </w:r>
       <w:r>
@@ -5953,10 +5953,7 @@
         <w:t>erreur quadratique moyenne</w:t>
       </w:r>
       <w:r>
-        <w:t xml:space="preserve"> </w:t>
-      </w:r>
-      <w:r>
-        <w:t xml:space="preserve">(MSE) entre patch prédit et patch vrai, calculée </w:t>
+        <w:t xml:space="preserve"> (MSE) entre patch prédit et patch vrai, calculée </w:t>
       </w:r>
       <w:r>
         <w:rPr>
@@ -6373,7 +6370,11 @@
               <w:pStyle w:val="Compact"/>
             </w:pPr>
             <w:r>
-              <w:t>un modèle entraîné sur les données regroupées de tous les sujets, testé sur chacun</w:t>
+              <w:t xml:space="preserve">un modèle entraîné sur </w:t>
+            </w:r>
+            <w:r>
+              <w:lastRenderedPageBreak/>
+              <w:t>les données regroupées de tous les sujets, testé sur chacun</w:t>
             </w:r>
           </w:p>
         </w:tc>
@@ -6386,7 +6387,12 @@
               <w:pStyle w:val="Compact"/>
             </w:pPr>
             <w:r>
-              <w:t>motifs partagés ; régime riche en données</w:t>
+              <w:lastRenderedPageBreak/>
+              <w:t xml:space="preserve">motifs partagés ; </w:t>
+            </w:r>
+            <w:r>
+              <w:lastRenderedPageBreak/>
+              <w:t>régime riche en données</w:t>
             </w:r>
           </w:p>
         </w:tc>
@@ -6401,6 +6407,7 @@
               <w:pStyle w:val="Compact"/>
             </w:pPr>
             <w:r>
+              <w:lastRenderedPageBreak/>
               <w:t>2</w:t>
             </w:r>
           </w:p>
@@ -6444,11 +6451,7 @@
               <w:pStyle w:val="Compact"/>
             </w:pPr>
             <w:r>
-              <w:t xml:space="preserve">BCI classique calibrée par utilisateur ; régime </w:t>
-            </w:r>
-            <w:r>
-              <w:lastRenderedPageBreak/>
-              <w:t>pauvre</w:t>
+              <w:t>BCI classique calibrée par utilisateur ; régime pauvre</w:t>
             </w:r>
           </w:p>
         </w:tc>
@@ -6463,7 +6466,6 @@
               <w:pStyle w:val="Compact"/>
             </w:pPr>
             <w:r>
-              <w:lastRenderedPageBreak/>
               <w:t>3</w:t>
             </w:r>
           </w:p>
@@ -7133,6 +7135,7 @@
           <w:b/>
           <w:bCs/>
         </w:rPr>
+        <w:lastRenderedPageBreak/>
         <w:t>Un pré-entraînement simple suffit.</w:t>
       </w:r>
       <w:r>
@@ -7147,9 +7150,8 @@
         <w:rPr>
           <w:noProof/>
         </w:rPr>
-        <w:lastRenderedPageBreak/>
         <w:drawing>
-          <wp:inline distT="0" distB="0" distL="0" distR="0" wp14:anchorId="7784E757" wp14:editId="7784E758">
+          <wp:inline distT="0" distB="0" distL="0" distR="0" wp14:anchorId="402A6856" wp14:editId="402A6857">
             <wp:extent cx="5334000" cy="2604648"/>
             <wp:effectExtent l="0" t="0" r="0" b="0"/>
             <wp:docPr id="43" name="Picture" descr="Rangs moyens du benchmark ST-EEGFormer"/>
@@ -7461,6 +7463,7 @@
           <w:b/>
           <w:bCs/>
         </w:rPr>
+        <w:lastRenderedPageBreak/>
         <w:t xml:space="preserve">Étape 3 — </w:t>
       </w:r>
       <w:r>
@@ -7564,7 +7567,6 @@
           <w:b/>
           <w:bCs/>
         </w:rPr>
-        <w:lastRenderedPageBreak/>
         <w:t>Étape 4 — Encodeur.</w:t>
       </w:r>
       <w:r>
@@ -8166,6 +8168,7 @@
       <w:bookmarkStart w:id="39" w:name="ladaptation-aval"/>
       <w:bookmarkEnd w:id="38"/>
       <w:r>
+        <w:lastRenderedPageBreak/>
         <w:t>3.5.3 L’adaptation aval</w:t>
       </w:r>
     </w:p>
@@ -8223,15 +8226,7 @@
           <w:i/>
           <w:iCs/>
         </w:rPr>
-        <w:t xml:space="preserve">si le fine-tuning efface </w:t>
-      </w:r>
-      <w:r>
-        <w:rPr>
-          <w:i/>
-          <w:iCs/>
-        </w:rPr>
-        <w:lastRenderedPageBreak/>
-        <w:t>l’essentiel de la spécialisation acquise au pré-entraînement, la nature de cet objectif — continu ou discret — cesse d’être discriminante</w:t>
+        <w:t>si le fine-tuning efface l’essentiel de la spécialisation acquise au pré-entraînement, la nature de cet objectif — continu ou discret — cesse d’être discriminante</w:t>
       </w:r>
       <w:r>
         <w:t>.</w:t>
@@ -8256,7 +8251,7 @@
           <w:noProof/>
         </w:rPr>
         <w:drawing>
-          <wp:inline distT="0" distB="0" distL="0" distR="0" wp14:anchorId="7784E759" wp14:editId="7784E75A">
+          <wp:inline distT="0" distB="0" distL="0" distR="0" wp14:anchorId="402A6858" wp14:editId="402A6859">
             <wp:extent cx="5334000" cy="4096512"/>
             <wp:effectExtent l="0" t="0" r="0" b="0"/>
             <wp:docPr id="51" name="Picture" descr="Architectures comparées sur nos données"/>
@@ -8590,6 +8585,7 @@
               <w:pStyle w:val="Compact"/>
             </w:pPr>
             <w:r>
+              <w:lastRenderedPageBreak/>
               <w:t>Identité de l’électrode</w:t>
             </w:r>
           </w:p>
@@ -8770,11 +8766,7 @@
               <w:pStyle w:val="Compact"/>
             </w:pPr>
             <w:r>
-              <w:t xml:space="preserve">l’indice du code du patch </w:t>
-            </w:r>
-            <w:r>
-              <w:lastRenderedPageBreak/>
-              <w:t>(dictionnaire appris sur le spectre de Fourier)</w:t>
+              <w:t>l’indice du code du patch (dictionnaire appris sur le spectre de Fourier)</w:t>
             </w:r>
           </w:p>
         </w:tc>
@@ -8789,7 +8781,6 @@
               <w:pStyle w:val="Compact"/>
             </w:pPr>
             <w:r>
-              <w:lastRenderedPageBreak/>
               <w:t>Perte</w:t>
             </w:r>
           </w:p>
@@ -9201,6 +9192,7 @@
         <w:pStyle w:val="FirstParagraph"/>
       </w:pPr>
       <w:r>
+        <w:lastRenderedPageBreak/>
         <w:t>L’analogie qui en résulte, et que j’ai présentée au laboratoire les 13 et 19 août 2026, est directement utile :</w:t>
       </w:r>
     </w:p>
@@ -9234,11 +9226,7 @@
         <w:pStyle w:val="FirstParagraph"/>
       </w:pPr>
       <w:r>
-        <w:t xml:space="preserve">L’intérêt pratique de cette mise en correspondance est double. D’une part, elle a corrigé une erreur que j’avais commise le 6 août en décrivant ST-EEGFormer comme « tokenisé » : la lecture du code </w:t>
-      </w:r>
-      <w:r>
-        <w:lastRenderedPageBreak/>
-        <w:t xml:space="preserve">montre l’inverse. D’autre part, elle déplace la question de recherche. L’idée « se passer de tokenisation » est </w:t>
+        <w:t xml:space="preserve">L’intérêt pratique de cette mise en correspondance est double. D’une part, elle a corrigé une erreur que j’avais commise le 6 août en décrivant ST-EEGFormer comme « tokenisé » : la lecture du code montre l’inverse. D’autre part, elle déplace la question de recherche. L’idée « se passer de tokenisation » est </w:t>
       </w:r>
       <w:r>
         <w:rPr>
@@ -9362,7 +9350,7 @@
         <w:pStyle w:val="Titre1"/>
       </w:pPr>
       <w:bookmarkStart w:id="43" w:name="matériel-et-méthodes"/>
-      <w:bookmarkStart w:id="44" w:name="_Toc239949765"/>
+      <w:bookmarkStart w:id="44" w:name="_Toc239952076"/>
       <w:bookmarkEnd w:id="42"/>
       <w:bookmarkEnd w:id="24"/>
       <w:r>
@@ -9472,10 +9460,20 @@
         <w:t>Morioka et al. (2014)</w:t>
       </w:r>
       <w:r>
-        <w:t>. Le PDF de cet article n’étant pas disponible sur la machine de rédaction, je m’en tiens à c</w:t>
-      </w:r>
-      <w:r>
-        <w:t>e que le laboratoire utilise opérationnellement — fenêtre d’attention de 8 s, deux classes, 43 sujets — sans extrapoler sur le protocole original.</w:t>
+        <w:t xml:space="preserve">, publiés dans </w:t>
+      </w:r>
+      <w:r>
+        <w:rPr>
+          <w:i/>
+          <w:iCs/>
+        </w:rPr>
+        <w:t>NeuroImage</w:t>
+      </w:r>
+      <w:r>
+        <w:t xml:space="preserve"> par le groupe du professeur Ishii (décodage de l’attention spatiale</w:t>
+      </w:r>
+      <w:r>
+        <w:t xml:space="preserve"> à partir de courants corticaux estimés depuis l’EEG, avec une information a priori issue de la spectroscopie proche infrarouge). Je n’ai pas relu cet article en détail : je m’en tiens à ce que le laboratoire utilise opérationnellement — fenêtre d’attention de 8 s, deux classes, 43 sujets — sans extrapoler sur le protocole original.</w:t>
       </w:r>
     </w:p>
     <w:p>
@@ -10110,7 +10108,11 @@
         <w:t>util/prepare_atr_nbp_spatial_attention.py</w:t>
       </w:r>
       <w:r>
-        <w:t>, réécrit pour reproduire le pipeline LaBraM de Liz Costato (</w:t>
+        <w:t xml:space="preserve">, réécrit pour reproduire le pipeline LaBraM </w:t>
+      </w:r>
+      <w:r>
+        <w:lastRenderedPageBreak/>
+        <w:t>de Liz Costato (</w:t>
       </w:r>
       <w:r>
         <w:rPr>
@@ -10146,7 +10148,6 @@
         <w:pStyle w:val="Corpsdetexte"/>
       </w:pPr>
       <w:r>
-        <w:lastRenderedPageBreak/>
         <w:t>Étapes, dans l’ordre :</w:t>
       </w:r>
     </w:p>
@@ -10316,7 +10317,10 @@
         <w:t>Correction de ligne de base</w:t>
       </w:r>
       <w:r>
-        <w:t xml:space="preserve"> : soustraction, canal par canal, de la moyenne de la période contrôle qui précède immédiatement l’essai.</w:t>
+        <w:t xml:space="preserve"> </w:t>
+      </w:r>
+      <w:r>
+        <w:t>: soustraction, canal par canal, de la moyenne de la période contrôle qui précède immédiatement l’essai.</w:t>
       </w:r>
     </w:p>
     <w:p>
@@ -10335,10 +10339,7 @@
         <w:t>Extraction de la fenêtre d’attention de 8 s</w:t>
       </w:r>
       <w:r>
-        <w:t xml:space="preserve"> </w:t>
-      </w:r>
-      <w:r>
-        <w:t>à partir de l’onset (2048 échantillons).</w:t>
+        <w:t xml:space="preserve"> à partir de l’onset (2048 échantillons).</w:t>
       </w:r>
     </w:p>
     <w:p>
@@ -10543,10 +10544,10 @@
         <w:t>keep 64 channels for ViT model</w:t>
       </w:r>
       <w:r>
-        <w:t xml:space="preserve"> dans les journaux. Ce détail n’est pas cosmétique : lorsque ce fichier est abse</w:t>
-      </w:r>
-      <w:r>
-        <w:t xml:space="preserve">nt, le code d’origine se replie sur un </w:t>
+        <w:t xml:space="preserve"> </w:t>
+      </w:r>
+      <w:r>
+        <w:t xml:space="preserve">dans les journaux. Ce détail n’est pas cosmétique : lorsque ce fichier est absent, le code d’origine se replie sur un </w:t>
       </w:r>
       <w:r>
         <w:rPr>
@@ -10664,7 +10665,11 @@
         <w:t>1024 échantillons</w:t>
       </w:r>
       <w:r>
-        <w:t xml:space="preserve">, soit 64 patches de 16 échantillons par canal, soit </w:t>
+        <w:t xml:space="preserve">, soit 64 patches de 16 </w:t>
+      </w:r>
+      <w:r>
+        <w:lastRenderedPageBreak/>
+        <w:t xml:space="preserve">échantillons par canal, soit </w:t>
       </w:r>
       <w:r>
         <w:rPr>
@@ -10698,7 +10703,6 @@
           <w:b/>
           <w:bCs/>
         </w:rPr>
-        <w:lastRenderedPageBreak/>
         <w:t>Tête de classification.</w:t>
       </w:r>
       <w:r>
@@ -11232,6 +11236,7 @@
               <w:rPr>
                 <w:rStyle w:val="VerbatimChar"/>
               </w:rPr>
+              <w:lastRenderedPageBreak/>
               <w:t>kng07</w:t>
             </w:r>
             <w:r>
@@ -11339,7 +11344,6 @@
               <w:rPr>
                 <w:rStyle w:val="VerbatimChar"/>
               </w:rPr>
-              <w:lastRenderedPageBreak/>
               <w:t>kng11</w:t>
             </w:r>
             <w:r>
@@ -11864,6 +11868,7 @@
           <w:b/>
           <w:bCs/>
         </w:rPr>
+        <w:lastRenderedPageBreak/>
         <w:t>Hyperparamètres retenus</w:t>
       </w:r>
       <w:r>
@@ -11878,7 +11883,6 @@
         <w:rPr>
           <w:rStyle w:val="VerbatimChar"/>
         </w:rPr>
-        <w:lastRenderedPageBreak/>
         <w:t>--optimizer_spec finetune --layer_decay 1.0 --lr 0.0003</w:t>
       </w:r>
       <w:r>
@@ -12004,7 +12008,7 @@
         <w:pStyle w:val="Titre1"/>
       </w:pPr>
       <w:bookmarkStart w:id="53" w:name="travail-réalisé"/>
-      <w:bookmarkStart w:id="54" w:name="_Toc239949766"/>
+      <w:bookmarkStart w:id="54" w:name="_Toc239952077"/>
       <w:bookmarkEnd w:id="52"/>
       <w:bookmarkEnd w:id="43"/>
       <w:r>
@@ -12045,26 +12049,17 @@
         <w:pStyle w:val="FirstParagraph"/>
       </w:pPr>
       <w:r>
-        <w:t>Dès l’arrivée (début avril), un MacBook Pro du laboratoire m’a été attribué. Ishii-sensei a présenté Liz Costato et la répartition des sujets. Les premiers documents de lecture (</w:t>
-      </w:r>
-      <w:r>
-        <w:rPr>
-          <w:rStyle w:val="VerbatimChar"/>
-        </w:rPr>
-        <w:t>EEG_STATE</w:t>
-      </w:r>
-      <w:r>
-        <w:t xml:space="preserve">, revue </w:t>
+        <w:t xml:space="preserve">Dès l’arrivée (début avril), un MacBook Pro du laboratoire m’a été attribué. Ishii-sensei a présenté Liz Costato et la répartition des sujets. Le premier document de lecture, la revue </w:t>
       </w:r>
       <w:r>
         <w:rPr>
           <w:i/>
           <w:iCs/>
         </w:rPr>
-        <w:t>EEG Foundation Models: A Critical Review…</w:t>
-      </w:r>
-      <w:r>
-        <w:t xml:space="preserve">) ont abouti, vers le 10 avril, à un </w:t>
+        <w:t>EEG Foundation Models: A Critical Review of Current Progress and Future Directions</w:t>
+      </w:r>
+      <w:r>
+        <w:t xml:space="preserve"> (Kuruppu et al., 2026), a abouti, vers le 10 avril, à un </w:t>
       </w:r>
       <w:r>
         <w:rPr>
@@ -14653,7 +14648,7 @@
         <w:pStyle w:val="Titre1"/>
       </w:pPr>
       <w:bookmarkStart w:id="66" w:name="résultats"/>
-      <w:bookmarkStart w:id="67" w:name="_Toc239949767"/>
+      <w:bookmarkStart w:id="67" w:name="_Toc239952078"/>
       <w:bookmarkEnd w:id="65"/>
       <w:bookmarkEnd w:id="53"/>
       <w:r>
@@ -15326,7 +15321,7 @@
         </w:rPr>
         <w:lastRenderedPageBreak/>
         <w:drawing>
-          <wp:inline distT="0" distB="0" distL="0" distR="0" wp14:anchorId="7784E75B" wp14:editId="7784E75C">
+          <wp:inline distT="0" distB="0" distL="0" distR="0" wp14:anchorId="402A685A" wp14:editId="402A685B">
             <wp:extent cx="5334000" cy="3046851"/>
             <wp:effectExtent l="0" t="0" r="0" b="0"/>
             <wp:docPr id="81" name="Picture" descr="Prétraitement v1 versus v2"/>
@@ -15851,7 +15846,7 @@
         </w:rPr>
         <w:lastRenderedPageBreak/>
         <w:drawing>
-          <wp:inline distT="0" distB="0" distL="0" distR="0" wp14:anchorId="7784E75D" wp14:editId="7784E75E">
+          <wp:inline distT="0" distB="0" distL="0" distR="0" wp14:anchorId="402A685C" wp14:editId="402A685D">
             <wp:extent cx="5334000" cy="3080197"/>
             <wp:effectExtent l="0" t="0" r="0" b="0"/>
             <wp:docPr id="85" name="Picture" descr="Courbe d’apprentissage population"/>
@@ -16840,7 +16835,7 @@
         <w:pStyle w:val="Titre1"/>
       </w:pPr>
       <w:bookmarkStart w:id="74" w:name="discussion-limites-et-perspectives"/>
-      <w:bookmarkStart w:id="75" w:name="_Toc239949768"/>
+      <w:bookmarkStart w:id="75" w:name="_Toc239952079"/>
       <w:bookmarkEnd w:id="73"/>
       <w:bookmarkEnd w:id="66"/>
       <w:r>
@@ -18087,10 +18082,10 @@
         <w:t>coordonnées 3D</w:t>
       </w:r>
       <w:r>
-        <w:t xml:space="preserve"> du montage, qui g</w:t>
-      </w:r>
-      <w:r>
-        <w:t xml:space="preserve">énéralise à un casque jamais vu. C’est la piste la plus directement liée à la question du LOSO, et la plus coûteuse. Statut : prospectif ; un premier pas peu cher est le </w:t>
+        <w:t xml:space="preserve"> </w:t>
+      </w:r>
+      <w:r>
+        <w:t xml:space="preserve">du montage, qui généralise à un casque jamais vu. C’est la piste la plus directement liée à la question du LOSO, et la plus coûteuse. Statut : prospectif ; un premier pas peu cher est le </w:t>
       </w:r>
       <w:r>
         <w:rPr>
@@ -18100,10 +18095,7 @@
         <w:t>dropout</w:t>
       </w:r>
       <w:r>
-        <w:t xml:space="preserve"> </w:t>
-      </w:r>
-      <w:r>
-        <w:t>de canaux au fine-tuning, testable sans re-pré-entraîner.</w:t>
+        <w:t xml:space="preserve"> de canaux au fine-tuning, testable sans re-pré-entraîner.</w:t>
       </w:r>
     </w:p>
     <w:p>
@@ -19217,7 +19209,7 @@
         <w:pStyle w:val="Titre1"/>
       </w:pPr>
       <w:bookmarkStart w:id="89" w:name="conclusion"/>
-      <w:bookmarkStart w:id="90" w:name="_Toc239949769"/>
+      <w:bookmarkStart w:id="90" w:name="_Toc239952080"/>
       <w:bookmarkEnd w:id="88"/>
       <w:bookmarkEnd w:id="74"/>
       <w:r>
@@ -19771,7 +19763,7 @@
         <w:pStyle w:val="Titre1"/>
       </w:pPr>
       <w:bookmarkStart w:id="94" w:name="bibliographie"/>
-      <w:bookmarkStart w:id="95" w:name="_Toc239949770"/>
+      <w:bookmarkStart w:id="95" w:name="_Toc239952081"/>
       <w:bookmarkEnd w:id="93"/>
       <w:bookmarkEnd w:id="89"/>
       <w:r>
@@ -19785,7 +19777,7 @@
         <w:pStyle w:val="FirstParagraph"/>
       </w:pPr>
       <w:r>
-        <w:t>Les références sont classées par thème. Les métadonnées des travaux cités par le papier support ont été relevées dans sa propre bibliographie (PDF disponible localement) ; celles qui n’ont pas pu être vérifiées sur ce poste sont signalées.</w:t>
+        <w:t>Les références sont classées par thème. Chaque entrée comporte un lien pérenne (DOI, arXiv ou dépôt de code). Les articles marqués « lu en PDF » ont été consultés intégralement pendant le stage ; les autres sont cités à partir du papier support ou des séminaires du laboratoire.</w:t>
       </w:r>
     </w:p>
     <w:p>
@@ -19823,35 +19815,21 @@
         <w:t>Are EEG Foundation Models Worth It? Comparative Evaluation with Traditional Decoders in Diverse BCI Tasks.</w:t>
       </w:r>
       <w:r>
-        <w:t xml:space="preserve"> </w:t>
-      </w:r>
-      <w:r>
-        <w:t xml:space="preserve">The Fourteenth International Conference on Learning Representations (ICLR 2026). OpenReview : </w:t>
-      </w:r>
-      <w:r>
-        <w:rPr>
-          <w:rStyle w:val="VerbatimChar"/>
-        </w:rPr>
-        <w:t>https://openreview.net/forum?id=5Xwm8e6vbh</w:t>
-      </w:r>
-      <w:r>
-        <w:t xml:space="preserve">. Code et poids : </w:t>
-      </w:r>
-      <w:r>
-        <w:rPr>
-          <w:rStyle w:val="VerbatimChar"/>
-        </w:rPr>
-        <w:t>https://github.com/LiuyinYang1101/STEEGFormer</w:t>
-      </w:r>
-      <w:r>
-        <w:t xml:space="preserve"> (licence MIT pour le code). — </w:t>
+        <w:t xml:space="preserve"> The Fourteenth International Conference on Learning Representations (ICLR 2026). OpenReview : https://openreview.net/forum?id=5Xwm8e6vbh. Code et poids : https://github.com/LiuyinYang1101/STEEGFormer (licence MIT). — </w:t>
       </w:r>
       <w:r>
         <w:rPr>
           <w:i/>
           <w:iCs/>
         </w:rPr>
-        <w:t>Article et matériel supplémentaire consultés en PDF ; la page OpenReview n’a pas pu être ouverte depuis la machine de rédaction (vérification anti-robot).</w:t>
+        <w:t>Article et matériel supplémentaire lus en PDF (66 pages) ; les chiffres cités au chapitre 3 (8 M de segments, 142 électrodes, 128 Hz, fenêtres de 6 s, masquage 75 %, 16 × A100-80 Go, 32 61</w:t>
+      </w:r>
+      <w:r>
+        <w:rPr>
+          <w:i/>
+          <w:iCs/>
+        </w:rPr>
+        <w:t>4 heures-GPU) en sont tirés directement.</w:t>
       </w:r>
     </w:p>
     <w:p>
@@ -19890,7 +19868,7 @@
         <w:t>BENDR: Using Transformers and a Contrastive Self-Supervised Learning Task to Learn from Massive Amounts of EEG Data.</w:t>
       </w:r>
       <w:r>
-        <w:t xml:space="preserve"> arXiv:2101.12037.</w:t>
+        <w:t xml:space="preserve"> Frontiers in Human Neuroscience, 15, 653659. arXiv : https://arxiv.org/abs/2101.12037.</w:t>
       </w:r>
     </w:p>
     <w:p>
@@ -19919,7 +19897,7 @@
         <w:t>BIOT: Cross-data Biosignal Learning in the Wild.</w:t>
       </w:r>
       <w:r>
-        <w:t xml:space="preserve"> arXiv:2305.10351.</w:t>
+        <w:t xml:space="preserve"> Advances in Neural Information Processing Systems 36 (NeurIPS 2023). arXiv : https://arxiv.org/abs/2305.10351.</w:t>
       </w:r>
     </w:p>
     <w:p>
@@ -19948,16 +19926,7 @@
         <w:t>Large Brain Model for Learning Generic Representations with Tremendous EEG Data in BCI</w:t>
       </w:r>
       <w:r>
-        <w:t xml:space="preserve"> (LaBraM). The Twelfth International Conference on Learning Representations (ICLR 2024). arXiv:2405.18765. Code : </w:t>
-      </w:r>
-      <w:r>
-        <w:rPr>
-          <w:rStyle w:val="VerbatimChar"/>
-        </w:rPr>
-        <w:t>https://github.com/935963004/LaBraM</w:t>
-      </w:r>
-      <w:r>
-        <w:t xml:space="preserve"> (copie de l’encodeur dans </w:t>
+        <w:t xml:space="preserve"> (LaBraM). The Twelfth International Conference on Learning Representations (ICLR 2024). arXiv : https://arxiv.org/abs/2405.18765. Code : https://github.com/935963004/LaBraM (copie de l’encodeur dans </w:t>
       </w:r>
       <w:r>
         <w:rPr>
@@ -19966,7 +19935,21 @@
         <w:t>benchmark/neural_networks/models/labram.py</w:t>
       </w:r>
       <w:r>
-        <w:t xml:space="preserve"> du dépôt ST-EEGFormer).</w:t>
+        <w:t xml:space="preserve"> du dépôt ST-EEGFormer). — </w:t>
+      </w:r>
+      <w:r>
+        <w:rPr>
+          <w:i/>
+          <w:iCs/>
+        </w:rPr>
+        <w:t>Les valeurs citées en § 3.5 (dictionnaire de 8 192 codes, taux de masquage 0,5, ~2 500 h de pré-entraînement, 5,8 M / 46 M / 369 M de paramètres) pr</w:t>
+      </w:r>
+      <w:r>
+        <w:rPr>
+          <w:i/>
+          <w:iCs/>
+        </w:rPr>
+        <w:t>oviennent du texte et des tables d’hyperparamètres de l’article.</w:t>
       </w:r>
     </w:p>
     <w:p>
@@ -19995,7 +19978,7 @@
         <w:t>EEGPT: Pretrained Transformer for Universal and Reliable Representation of EEG Signals.</w:t>
       </w:r>
       <w:r>
-        <w:t xml:space="preserve"> Advances in Neural Information Processing Systems 37, 39249–39280.</w:t>
+        <w:t xml:space="preserve"> Advances in Neural Information Processing Systems 37 (NeurIPS 2024). Code : https://github.com/BINE022/EEGPT.</w:t>
       </w:r>
     </w:p>
     <w:p>
@@ -20024,7 +20007,7 @@
         <w:t>CBraMod: A Criss-Cross Brain Foundation Model for EEG Decoding.</w:t>
       </w:r>
       <w:r>
-        <w:t xml:space="preserve"> arXiv:2412.07236.</w:t>
+        <w:t xml:space="preserve"> ICLR 2025. arXiv : https://arxiv.org/abs/2412.07236.</w:t>
       </w:r>
     </w:p>
     <w:p>
@@ -20037,23 +20020,30 @@
       </w:pPr>
       <w:r>
         <w:rPr>
+          <w:b/>
+          <w:bCs/>
+        </w:rPr>
+        <w:t>Kuruppu, G., Wagh, N., Kremen, V., &amp; Varatharajah, Y.</w:t>
+      </w:r>
+      <w:r>
+        <w:t xml:space="preserve"> (2026). </w:t>
+      </w:r>
+      <w:r>
+        <w:rPr>
           <w:i/>
           <w:iCs/>
         </w:rPr>
         <w:t>EEG Foundation Models: A Critical Review of Current Progress and Future Directions.</w:t>
       </w:r>
       <w:r>
-        <w:t xml:space="preserve"> — Revue remise par le professeur Ishii en avril 2026 et présentée au séminaire du laboratoire. </w:t>
-      </w:r>
-      <w:r>
-        <w:rPr>
-          <w:b/>
-          <w:bCs/>
-        </w:rPr>
-        <w:t>Le PDF n’est pas présent sur la machine de rédaction</w:t>
-      </w:r>
-      <w:r>
-        <w:t xml:space="preserve"> ; seule ma présentation dérivée l’est. Références bibliographiques complètes à compléter avant dépôt.</w:t>
+        <w:t xml:space="preserve"> Journal of Neural Engineering, 23(2), 021001. DOI : https://doi.org/10.1088/1741-2552/ae4455. Prépublication : https://arxiv.org/abs/2507.11783. — </w:t>
+      </w:r>
+      <w:r>
+        <w:rPr>
+          <w:i/>
+          <w:iCs/>
+        </w:rPr>
+        <w:t>Revue remise par le professeur Ishii en avril 2026, lue en PDF et présentée au séminaire interne du laboratoire.</w:t>
       </w:r>
     </w:p>
     <w:p>
@@ -20092,7 +20082,7 @@
         <w:t>An Image is Worth 16×16 Words: Transformers for Image Recognition at Scale.</w:t>
       </w:r>
       <w:r>
-        <w:t xml:space="preserve"> arXiv:2010.11929. (Vision Transformer.)</w:t>
+        <w:t xml:space="preserve"> ICLR 2021. arXiv : https://arxiv.org/abs/2010.11929. (Vision Transformer.)</w:t>
       </w:r>
     </w:p>
     <w:p>
@@ -20108,6 +20098,7 @@
           <w:b/>
           <w:bCs/>
         </w:rPr>
+        <w:lastRenderedPageBreak/>
         <w:t>He, K., Chen, X., Xie, S., Li, Y., Dollár, P., &amp; Girshick, R.</w:t>
       </w:r>
       <w:r>
@@ -20121,7 +20112,7 @@
         <w:t>Masked Autoencoders Are Scalable Vision Learners.</w:t>
       </w:r>
       <w:r>
-        <w:t xml:space="preserve"> IEEE/CVF CVPR 2022. (MAE.)</w:t>
+        <w:t xml:space="preserve"> IEEE/CVF CVPR 2022. arXiv : https://arxiv.org/abs/2111.06377. (MAE.)</w:t>
       </w:r>
     </w:p>
     <w:p>
@@ -20136,6 +20127,7 @@
     </w:p>
     <w:p>
       <w:pPr>
+        <w:pStyle w:val="Compact"/>
         <w:numPr>
           <w:ilvl w:val="0"/>
           <w:numId w:val="27"/>
@@ -20159,11 +20151,12 @@
         <w:t>Optimal Spatial Filtering of Single Trial EEG During Imagined Hand Movement.</w:t>
       </w:r>
       <w:r>
-        <w:t xml:space="preserve"> IEEE Transactions on Rehabilitation Engineering, 8(4), 441–446. (CSP.)</w:t>
-      </w:r>
-    </w:p>
-    <w:p>
-      <w:pPr>
+        <w:t xml:space="preserve"> IEEE Transactions on Rehabilitation Engineering, 8(4), 441–446. DOI : https://doi.org/10.1109/86.895946. (CSP.)</w:t>
+      </w:r>
+    </w:p>
+    <w:p>
+      <w:pPr>
+        <w:pStyle w:val="Compact"/>
         <w:numPr>
           <w:ilvl w:val="0"/>
           <w:numId w:val="27"/>
@@ -20187,11 +20180,12 @@
         <w:t>Filter Bank Common Spatial Pattern (FBCSP) in Brain–Computer Interface.</w:t>
       </w:r>
       <w:r>
-        <w:t xml:space="preserve"> IEEE IJCNN 2008.</w:t>
-      </w:r>
-    </w:p>
-    <w:p>
-      <w:pPr>
+        <w:t xml:space="preserve"> IEEE International Joint Conference on Neural Networks (IJCNN 2008), 2390–2397. DOI : https://doi.org/10.1109/IJCNN.2008.4634130.</w:t>
+      </w:r>
+    </w:p>
+    <w:p>
+      <w:pPr>
+        <w:pStyle w:val="Compact"/>
         <w:numPr>
           <w:ilvl w:val="0"/>
           <w:numId w:val="27"/>
@@ -20202,7 +20196,6 @@
           <w:b/>
           <w:bCs/>
         </w:rPr>
-        <w:lastRenderedPageBreak/>
         <w:t>Congedo, M., Barachant, A., &amp; Bhatia, R.</w:t>
       </w:r>
       <w:r>
@@ -20216,11 +20209,12 @@
         <w:t>Riemannian Geometry for EEG-based Brain-Computer Interfaces: A Primer and a Review.</w:t>
       </w:r>
       <w:r>
-        <w:t xml:space="preserve"> Brain-Computer Interfaces, 4(3), 155–174.</w:t>
-      </w:r>
-    </w:p>
-    <w:p>
-      <w:pPr>
+        <w:t xml:space="preserve"> Brain-Computer Interfaces, 4(3), 155–174. DOI : https://doi.org/10.1080/2326263X.2017.1297192.</w:t>
+      </w:r>
+    </w:p>
+    <w:p>
+      <w:pPr>
+        <w:pStyle w:val="Compact"/>
         <w:numPr>
           <w:ilvl w:val="0"/>
           <w:numId w:val="27"/>
@@ -20244,11 +20238,12 @@
         <w:t>Deep Learning with Convolutional Neural Networks for EEG Decoding and Visualization.</w:t>
       </w:r>
       <w:r>
-        <w:t xml:space="preserve"> Human Brain Mapping, 38(11), 5391–5420. (DeepConvNet.)</w:t>
-      </w:r>
-    </w:p>
-    <w:p>
-      <w:pPr>
+        <w:t xml:space="preserve"> Human Brain Mapping, 38(11), 5391–5420. DOI : https://doi.org/10.1002/hbm.23730. (DeepConvNet.)</w:t>
+      </w:r>
+    </w:p>
+    <w:p>
+      <w:pPr>
+        <w:pStyle w:val="Compact"/>
         <w:numPr>
           <w:ilvl w:val="0"/>
           <w:numId w:val="27"/>
@@ -20272,11 +20267,12 @@
         <w:t>EEGNet: A Compact Convolutional Neural Network for EEG-based Brain–Computer Interfaces.</w:t>
       </w:r>
       <w:r>
-        <w:t xml:space="preserve"> Journal of Neural Engineering, 15(5), 056013.</w:t>
-      </w:r>
-    </w:p>
-    <w:p>
-      <w:pPr>
+        <w:t xml:space="preserve"> Journal of Neural Engineering, 15(5), 056013. DOI : https://doi.org/10.1088/1741-2552/aace8c.</w:t>
+      </w:r>
+    </w:p>
+    <w:p>
+      <w:pPr>
+        <w:pStyle w:val="Compact"/>
         <w:numPr>
           <w:ilvl w:val="0"/>
           <w:numId w:val="27"/>
@@ -20300,11 +20296,12 @@
         <w:t>EEG Conformer: Convolutional Transformer for EEG Decoding and Visualization.</w:t>
       </w:r>
       <w:r>
-        <w:t xml:space="preserve"> IEEE TNSRE, 31, 710–719.</w:t>
-      </w:r>
-    </w:p>
-    <w:p>
-      <w:pPr>
+        <w:t xml:space="preserve"> IEEE Transactions on Neural Systems and Rehabilitation Engineering, 31, 710–719. DOI : https://doi.org/10.1109/TNSRE.2022.3230250.</w:t>
+      </w:r>
+    </w:p>
+    <w:p>
+      <w:pPr>
+        <w:pStyle w:val="Compact"/>
         <w:numPr>
           <w:ilvl w:val="0"/>
           <w:numId w:val="27"/>
@@ -20328,11 +20325,12 @@
         <w:t>CTNet: A Convolutional Transformer Network for EEG-based Motor Imagery Classification.</w:t>
       </w:r>
       <w:r>
-        <w:t xml:space="preserve"> Scientific Reports, 14(1), 20237.</w:t>
-      </w:r>
-    </w:p>
-    <w:p>
-      <w:pPr>
+        <w:t xml:space="preserve"> Scientific Reports, 14, 20237. DOI : https://doi.org/10.1038/s41598-024-71118-7.</w:t>
+      </w:r>
+    </w:p>
+    <w:p>
+      <w:pPr>
+        <w:pStyle w:val="Compact"/>
         <w:numPr>
           <w:ilvl w:val="0"/>
           <w:numId w:val="27"/>
@@ -20356,11 +20354,12 @@
         <w:t>Filter Bank Canonical Correlation Analysis for Implementing a High-Speed SSVEP-based Brain–Computer Interface.</w:t>
       </w:r>
       <w:r>
-        <w:t xml:space="preserve"> (FBCCA ; référence citée par le papier support.)</w:t>
-      </w:r>
-    </w:p>
-    <w:p>
-      <w:pPr>
+        <w:t xml:space="preserve"> Journal of Neural Engineering, 12(4), 046008. DOI : https://doi.org/10.1088/1741-2560/12/4/046008. (FBCCA ; référence citée par le papier support.)</w:t>
+      </w:r>
+    </w:p>
+    <w:p>
+      <w:pPr>
+        <w:pStyle w:val="Compact"/>
         <w:numPr>
           <w:ilvl w:val="0"/>
           <w:numId w:val="27"/>
@@ -20384,101 +20383,17 @@
         <w:t>Enhancing Detection of SSVEPs for a High-Speed Brain Speller Using Task-Related Component Analysis.</w:t>
       </w:r>
       <w:r>
-        <w:t xml:space="preserve"> (TRCA ; référence citée par le papier support.) ## Jeux de données</w:t>
-      </w:r>
-    </w:p>
-    <w:p>
-      <w:pPr>
-        <w:numPr>
-          <w:ilvl w:val="0"/>
-          <w:numId w:val="27"/>
-        </w:numPr>
-      </w:pPr>
-      <w:r>
-        <w:rPr>
-          <w:b/>
-          <w:bCs/>
-        </w:rPr>
-        <w:t>Tangermann, M., Müller, K.-R., Aertsen, A., et al.</w:t>
-      </w:r>
-      <w:r>
-        <w:t xml:space="preserve"> (2012). </w:t>
-      </w:r>
-      <w:r>
-        <w:rPr>
-          <w:i/>
-          <w:iCs/>
-        </w:rPr>
-        <w:t>Review of the BCI Competition IV.</w:t>
-      </w:r>
-      <w:r>
-        <w:t xml:space="preserve"> Frontiers in Neuroscience, 6, 55. (BCI-IV-2a, 4 classes, hasard 25 %.)</w:t>
-      </w:r>
-    </w:p>
-    <w:p>
-      <w:pPr>
-        <w:numPr>
-          <w:ilvl w:val="0"/>
-          <w:numId w:val="27"/>
-        </w:numPr>
-      </w:pPr>
-      <w:r>
-        <w:rPr>
-          <w:b/>
-          <w:bCs/>
-        </w:rPr>
-        <w:t>Morioka, H., et al.</w:t>
-      </w:r>
-      <w:r>
-        <w:t xml:space="preserve"> (2014). — Paradigme d’attention visuo-spatiale associé au jeu ATR NBP utilisé dans ce stage. </w:t>
-      </w:r>
-      <w:r>
-        <w:rPr>
-          <w:b/>
-          <w:bCs/>
-        </w:rPr>
-        <w:t>Référence complète non vérifiable sur la machine de rédaction (PDF absent).</w:t>
-      </w:r>
-      <w:r>
-        <w:t xml:space="preserve"> À compléter auprès du laboratoire avant dépôt ; les caractéristiques utilisées ici (2 classes, fenêtre d’attention de 8 s, 43 sujets) proviennent de l’usage opérationnel du laboratoire et de l’exploration directe des fichiers.</w:t>
-      </w:r>
-    </w:p>
-    <w:p>
-      <w:pPr>
-        <w:numPr>
-          <w:ilvl w:val="0"/>
-          <w:numId w:val="27"/>
-        </w:numPr>
-      </w:pPr>
-      <w:r>
-        <w:rPr>
-          <w:b/>
-          <w:bCs/>
-        </w:rPr>
-        <w:t>Obeid, I., &amp; Picone, J.</w:t>
-      </w:r>
-      <w:r>
-        <w:t xml:space="preserve"> (2016). </w:t>
-      </w:r>
-      <w:r>
-        <w:rPr>
-          <w:i/>
-          <w:iCs/>
-        </w:rPr>
-        <w:t>The Temple University Hospital EEG Data Corpus.</w:t>
-      </w:r>
-      <w:r>
-        <w:t xml:space="preserve"> (TUEG/TUEV, corpus de pré-entraînement fréquemment utilisé par les modèles de fondation EEG.)</w:t>
+        <w:t xml:space="preserve"> IEEE Transactions on Biomedical Engineering, 65(1), 104–112. DOI : https://doi.org/10.1109/TBME.2017.2694818. (TRCA ; référence citée par le papier support.)</w:t>
       </w:r>
     </w:p>
     <w:p>
       <w:pPr>
         <w:pStyle w:val="Titre2"/>
       </w:pPr>
-      <w:bookmarkStart w:id="100" w:name="Xd112ab783e2d2e6e458dd2b39fd5f9b3f6493c6"/>
+      <w:bookmarkStart w:id="100" w:name="jeux-de-données"/>
       <w:bookmarkEnd w:id="99"/>
       <w:r>
-        <w:t>Modèles de fondation en électrophysiologie et imagerie calcique</w:t>
+        <w:t>Jeux de données</w:t>
       </w:r>
     </w:p>
     <w:p>
@@ -20494,47 +20409,20 @@
           <w:b/>
           <w:bCs/>
         </w:rPr>
-        <w:t>Azabou, M., et al.</w:t>
-      </w:r>
-      <w:r>
-        <w:t xml:space="preserve"> (2023). </w:t>
+        <w:t>Tangermann, M., Müller, K.-R., Aertsen, A., et al.</w:t>
+      </w:r>
+      <w:r>
+        <w:t xml:space="preserve"> (2012). </w:t>
       </w:r>
       <w:r>
         <w:rPr>
           <w:i/>
           <w:iCs/>
         </w:rPr>
-        <w:t>A Unified, Scalable Framework for Neural Population Decoding</w:t>
-      </w:r>
-      <w:r>
-        <w:t xml:space="preserve"> (POYO). Advances in Neural Information Processing Systems 36 (NeurIPS 2023). Implémentation : </w:t>
-      </w:r>
-      <w:r>
-        <w:rPr>
-          <w:rStyle w:val="VerbatimChar"/>
-        </w:rPr>
-        <w:t>torch_brain</w:t>
-      </w:r>
-      <w:r>
-        <w:t xml:space="preserve"> / </w:t>
-      </w:r>
-      <w:r>
-        <w:rPr>
-          <w:rStyle w:val="VerbatimChar"/>
-        </w:rPr>
-        <w:t>brainsets</w:t>
-      </w:r>
-      <w:r>
-        <w:t xml:space="preserve"> (</w:t>
-      </w:r>
-      <w:r>
-        <w:rPr>
-          <w:rStyle w:val="VerbatimChar"/>
-        </w:rPr>
-        <w:t>https://github.com/neuro-galaxy/torch_brain</w:t>
-      </w:r>
-      <w:r>
-        <w:t>).</w:t>
+        <w:t>Review of the BCI Competition IV.</w:t>
+      </w:r>
+      <w:r>
+        <w:t xml:space="preserve"> Frontiers in Neuroscience, 6, 55. DOI : https://doi.org/10.3389/fnins.2012.00055. (BCI-IV-2a, 4 classes, hasard 25 %.) Données chargées via MOABB : https://github.com/NeuroTechX/moabb.</w:t>
       </w:r>
     </w:p>
     <w:p>
@@ -20550,20 +20438,34 @@
           <w:b/>
           <w:bCs/>
         </w:rPr>
-        <w:t>Azabou, M., et al.</w:t>
-      </w:r>
-      <w:r>
-        <w:t xml:space="preserve"> </w:t>
+        <w:t>Morioka, H., Kanemura, A., Morimoto, S., Yoshioka, T., Oba, S., Kawanabe, M., &amp; Ishii, S.</w:t>
+      </w:r>
+      <w:r>
+        <w:t xml:space="preserve"> (2014). </w:t>
       </w:r>
       <w:r>
         <w:rPr>
           <w:i/>
           <w:iCs/>
         </w:rPr>
-        <w:t>Neural Decoding from Distinct Cell-Types.</w:t>
-      </w:r>
-      <w:r>
-        <w:t xml:space="preserve"> — PDF fourni par le laboratoire ; métadonnées de publication à compléter.</w:t>
+        <w:t>Decoding Spatial Attention by Using Cortical Currents Estimated from Electroencephalography with Near-Infrared Spectroscopy Prior Information.</w:t>
+      </w:r>
+      <w:r>
+        <w:t xml:space="preserve"> NeuroImage, 90, 128–139. DOI : https://doi.org/10.1016/j.neuroimage.2013.12.035. — </w:t>
+      </w:r>
+      <w:r>
+        <w:rPr>
+          <w:i/>
+          <w:iCs/>
+        </w:rPr>
+        <w:t>Paradigme d’attention visuo-spatiale du groupe Ishii/ATR, associé au jeu de données ATR NBP utilisé dans ce stage. Les caractéristiques exploitées ici (2 classes, fenêtre d’attention de 8 s, 43 sujets) proviennent de l’usage opérationnel du laboratoire et de l’exploration dire</w:t>
+      </w:r>
+      <w:r>
+        <w:rPr>
+          <w:i/>
+          <w:iCs/>
+        </w:rPr>
+        <w:t>cte des fichiers ; l’article original n’a pas été relu en détail.</w:t>
       </w:r>
     </w:p>
     <w:p>
@@ -20579,103 +20481,31 @@
           <w:b/>
           <w:bCs/>
         </w:rPr>
-        <w:t>CalM.</w:t>
-      </w:r>
-      <w:r>
-        <w:t xml:space="preserve"> arXiv:2604.04958. Modèle de fondation pour l’imagerie calcique fondé sur un tokeniseur à quantification vectorielle et un transformeur </w:t>
+        <w:lastRenderedPageBreak/>
+        <w:t>Obeid, I., &amp; Picone, J.</w:t>
+      </w:r>
+      <w:r>
+        <w:t xml:space="preserve"> (2016). </w:t>
       </w:r>
       <w:r>
         <w:rPr>
           <w:i/>
           <w:iCs/>
         </w:rPr>
-        <w:t>dual-axis</w:t>
-      </w:r>
-      <w:r>
-        <w:t xml:space="preserve"> autorégressif. — </w:t>
-      </w:r>
-      <w:r>
-        <w:rPr>
-          <w:i/>
-          <w:iCs/>
-        </w:rPr>
-        <w:t>Lu en PDF local ; identifiant arXiv relevé dans les notes du laboratoire.</w:t>
-      </w:r>
-    </w:p>
-    <w:p>
-      <w:pPr>
-        <w:pStyle w:val="Compact"/>
-        <w:numPr>
-          <w:ilvl w:val="0"/>
-          <w:numId w:val="28"/>
-        </w:numPr>
-      </w:pPr>
-      <w:r>
-        <w:rPr>
-          <w:b/>
-          <w:bCs/>
-        </w:rPr>
-        <w:t>CAPT.</w:t>
-      </w:r>
-      <w:r>
-        <w:t xml:space="preserve"> arXiv:2607.23258. </w:t>
-      </w:r>
-      <w:r>
-        <w:rPr>
-          <w:i/>
-          <w:iCs/>
-        </w:rPr>
-        <w:t>Continuous patch tokenization</w:t>
-      </w:r>
-      <w:r>
-        <w:t xml:space="preserve"> pour l’imagerie calcique, objectif autorégressif en MSE, transfert inter-espèces à dorsale gelée. — </w:t>
-      </w:r>
-      <w:r>
-        <w:rPr>
-          <w:i/>
-          <w:iCs/>
-        </w:rPr>
-        <w:t>Lu en PDF local.</w:t>
-      </w:r>
-    </w:p>
-    <w:p>
-      <w:pPr>
-        <w:pStyle w:val="Compact"/>
-        <w:numPr>
-          <w:ilvl w:val="0"/>
-          <w:numId w:val="28"/>
-        </w:numPr>
-      </w:pPr>
-      <w:r>
-        <w:rPr>
-          <w:b/>
-          <w:bCs/>
-        </w:rPr>
-        <w:t>POCO.</w:t>
-      </w:r>
-      <w:r>
-        <w:t xml:space="preserve"> — Modèle de prévision d’activité calcique présenté au </w:t>
-      </w:r>
-      <w:r>
-        <w:rPr>
-          <w:i/>
-          <w:iCs/>
-        </w:rPr>
-        <w:t>paper reading club</w:t>
-      </w:r>
-      <w:r>
-        <w:t xml:space="preserve"> du 18 août 2026 ; référence à compléter.</w:t>
+        <w:t>The Temple University Hospital EEG Data Corpus.</w:t>
+      </w:r>
+      <w:r>
+        <w:t xml:space="preserve"> Frontiers in Neuroscience, 10, 196. DOI : https://doi.org/10.3389/fnins.2016.00196. (TUEG/TUEV, corpus de pré-entraînement fréquemment utilisé par les modèles de fondation EEG.)</w:t>
       </w:r>
     </w:p>
     <w:p>
       <w:pPr>
         <w:pStyle w:val="Titre2"/>
       </w:pPr>
-      <w:bookmarkStart w:id="101" w:name="X00c368d35fa9f1dd25d034accff17c81c806c4f"/>
+      <w:bookmarkStart w:id="101" w:name="Xd112ab783e2d2e6e458dd2b39fd5f9b3f6493c6"/>
       <w:bookmarkEnd w:id="100"/>
       <w:r>
-        <w:lastRenderedPageBreak/>
-        <w:t>Documents internes et sources primaires du stage</w:t>
+        <w:t>Modèles de fondation en électrophysiologie et imagerie calcique</w:t>
       </w:r>
     </w:p>
     <w:p>
@@ -20691,19 +20521,45 @@
           <w:b/>
           <w:bCs/>
         </w:rPr>
-        <w:t>Journal de bord du stage</w:t>
-      </w:r>
-      <w:r>
-        <w:t xml:space="preserve">, </w:t>
-      </w:r>
-      <w:r>
-        <w:rPr>
-          <w:rStyle w:val="VerbatimChar"/>
-        </w:rPr>
-        <w:t>torch-brain-eeg/notes/JOURNAL.md</w:t>
-      </w:r>
-      <w:r>
-        <w:t xml:space="preserve"> (avril–août 2026). Source de vérité pour toutes les dates, configurations et valeurs numériques citées dans les chapitres 5 et 6.</w:t>
+        <w:t>Azabou, M., Arora, V., Ganesh, V., Mao, X., Nachimuthu, S., Mendelson, M. J., Richards, B., Perich, M. G., Lajoie, G., &amp; Dyer, E. L.</w:t>
+      </w:r>
+      <w:r>
+        <w:t xml:space="preserve"> (2023). </w:t>
+      </w:r>
+      <w:r>
+        <w:rPr>
+          <w:i/>
+          <w:iCs/>
+        </w:rPr>
+        <w:t>A Unified, Scalable Framework for Neural Population Decoding</w:t>
+      </w:r>
+      <w:r>
+        <w:t xml:space="preserve"> (POYO). Advances in Neural Information Processing Systems 36 (NeurIPS 2023). arXiv : https://arxiv.org/abs/2310.16046. Implémentation : </w:t>
+      </w:r>
+      <w:r>
+        <w:rPr>
+          <w:rStyle w:val="VerbatimChar"/>
+        </w:rPr>
+        <w:t>torch_brain</w:t>
+      </w:r>
+      <w:r>
+        <w:t xml:space="preserve"> / </w:t>
+      </w:r>
+      <w:r>
+        <w:rPr>
+          <w:rStyle w:val="VerbatimChar"/>
+        </w:rPr>
+        <w:t>brainsets</w:t>
+      </w:r>
+      <w:r>
+        <w:t xml:space="preserve">, https://github.com/neuro-galaxy/torch_brain. — </w:t>
+      </w:r>
+      <w:r>
+        <w:rPr>
+          <w:i/>
+          <w:iCs/>
+        </w:rPr>
+        <w:t>Lu en PDF.</w:t>
       </w:r>
     </w:p>
     <w:p>
@@ -20719,19 +20575,27 @@
           <w:b/>
           <w:bCs/>
         </w:rPr>
-        <w:t>Fiche de lecture EEG ↔ imagerie calcique</w:t>
-      </w:r>
-      <w:r>
-        <w:t xml:space="preserve">, </w:t>
-      </w:r>
-      <w:r>
-        <w:rPr>
-          <w:rStyle w:val="VerbatimChar"/>
-        </w:rPr>
-        <w:t>notes/papers/README_meeting_2026-08-13.md</w:t>
-      </w:r>
-      <w:r>
-        <w:t>.</w:t>
+        <w:t>Azabou, M., Pan, K. X., Arora, V., Knight, I., Dyer, E. L., &amp; Richards, B.</w:t>
+      </w:r>
+      <w:r>
+        <w:t xml:space="preserve"> (2025). </w:t>
+      </w:r>
+      <w:r>
+        <w:rPr>
+          <w:i/>
+          <w:iCs/>
+        </w:rPr>
+        <w:t>Multi-Session, Multi-Task Neural Decoding from Distinct Cell-Types and Brain Regions.</w:t>
+      </w:r>
+      <w:r>
+        <w:t xml:space="preserve"> The Thirteenth International Conference on Learning Representations (ICLR 2025). OpenReview : https://openreview.net/forum?id=IuU0wcO0mo. — </w:t>
+      </w:r>
+      <w:r>
+        <w:rPr>
+          <w:i/>
+          <w:iCs/>
+        </w:rPr>
+        <w:t>Lu en PDF (fourni par le laboratoire).</w:t>
       </w:r>
     </w:p>
     <w:p>
@@ -20747,29 +20611,27 @@
           <w:b/>
           <w:bCs/>
         </w:rPr>
-        <w:t>Supports de présentation</w:t>
-      </w:r>
-      <w:r>
-        <w:t xml:space="preserve"> : séminaire de revue (avril), présentation d’article (mai), </w:t>
+        <w:t>Xu, X., Zhang, Y., Qian, Q., &amp; Zhang, Y.</w:t>
+      </w:r>
+      <w:r>
+        <w:t xml:space="preserve"> (2026). </w:t>
       </w:r>
       <w:r>
         <w:rPr>
           <w:i/>
           <w:iCs/>
         </w:rPr>
-        <w:t>progress talk</w:t>
-      </w:r>
-      <w:r>
-        <w:t xml:space="preserve"> du 23 juillet, exposé technique du 19 août — répertoire </w:t>
-      </w:r>
-      <w:r>
-        <w:rPr>
-          <w:rStyle w:val="VerbatimChar"/>
-        </w:rPr>
-        <w:t>STEEGFormer/presentations/</w:t>
-      </w:r>
-      <w:r>
-        <w:t>.</w:t>
+        <w:t>CalM: A Self-Supervised Foundation Model for Population Dynamics in Calcium Imaging Data.</w:t>
+      </w:r>
+      <w:r>
+        <w:t xml:space="preserve"> arXiv : https://arxiv.org/abs/2604.04958. — </w:t>
+      </w:r>
+      <w:r>
+        <w:rPr>
+          <w:i/>
+          <w:iCs/>
+        </w:rPr>
+        <w:t>Lu en PDF. Tokeniseur à quantification vectorielle et transformeur dual-axis autorégressif ; discuté au séminaire du 13 août et au paper reading club du 18 août 2026.</w:t>
       </w:r>
     </w:p>
     <w:p>
@@ -20785,46 +20647,63 @@
           <w:b/>
           <w:bCs/>
         </w:rPr>
-        <w:t>Code du stage</w:t>
-      </w:r>
-      <w:r>
-        <w:t xml:space="preserve"> : </w:t>
-      </w:r>
-      <w:r>
-        <w:rPr>
-          <w:rStyle w:val="VerbatimChar"/>
-        </w:rPr>
-        <w:t>util/prepare_atr_nbp_spatial_attention.py</w:t>
-      </w:r>
-      <w:r>
-        <w:t xml:space="preserve">, </w:t>
-      </w:r>
-      <w:r>
-        <w:rPr>
-          <w:rStyle w:val="VerbatimChar"/>
-        </w:rPr>
-        <w:t>util/dataset_specs_lab_spatial_attention.yaml</w:t>
-      </w:r>
-      <w:r>
-        <w:t xml:space="preserve">, </w:t>
-      </w:r>
-      <w:r>
-        <w:rPr>
-          <w:rStyle w:val="VerbatimChar"/>
-        </w:rPr>
-        <w:t>scripts/summarize_g2_json_logs.py</w:t>
-      </w:r>
-      <w:r>
-        <w:t xml:space="preserve">, scripts d’orchestration PowerShell et Slurm ; scripts de prétraitement </w:t>
-      </w:r>
-      <w:r>
-        <w:rPr>
-          <w:rStyle w:val="VerbatimChar"/>
-        </w:rPr>
-        <w:t>benchmark/spatial_attention/</w:t>
-      </w:r>
-      <w:r>
-        <w:t xml:space="preserve"> (alignement euclidien, laplacien/CSD, rejet d’artefacts — écrits, non encore exécutés au 10 septembre 2026).</w:t>
+        <w:t>Xu, X., Zhang, Y., &amp; Zhang, Y.</w:t>
+      </w:r>
+      <w:r>
+        <w:t xml:space="preserve"> (2026). </w:t>
+      </w:r>
+      <w:r>
+        <w:rPr>
+          <w:i/>
+          <w:iCs/>
+        </w:rPr>
+        <w:t>CAPT: A Multi-task Continuous Autoregressive Transformer Enabling Cross-dataset and Cross-species Transfer for Calcium Population Dynamics.</w:t>
+      </w:r>
+      <w:r>
+        <w:t xml:space="preserve"> arXiv : https://arxiv.org/abs/2607.23258. — </w:t>
+      </w:r>
+      <w:r>
+        <w:rPr>
+          <w:i/>
+          <w:iCs/>
+        </w:rPr>
+        <w:t>Lu en PDF. Continuous patch tokenization, objectif autorégressif en MSE, transfert inter-espèces à dorsale gelée.</w:t>
+      </w:r>
+    </w:p>
+    <w:p>
+      <w:pPr>
+        <w:pStyle w:val="Compact"/>
+        <w:numPr>
+          <w:ilvl w:val="0"/>
+          <w:numId w:val="29"/>
+        </w:numPr>
+      </w:pPr>
+      <w:r>
+        <w:rPr>
+          <w:b/>
+          <w:bCs/>
+        </w:rPr>
+        <w:t>Duan, Y., Tahir Chaudhry, H., Ahrens, M. B., Harvey, C. D., Perich, M. G., Deisseroth, K., &amp; Rajan, K.</w:t>
+      </w:r>
+      <w:r>
+        <w:t xml:space="preserve"> (2025). </w:t>
+      </w:r>
+      <w:r>
+        <w:rPr>
+          <w:i/>
+          <w:iCs/>
+        </w:rPr>
+        <w:t>POCO: Scalable Neural Forecasting through Population Conditioning.</w:t>
+      </w:r>
+      <w:r>
+        <w:t xml:space="preserve"> Advances in Neural Information Processing Systems 38 (NeurIPS 2025). arXiv : https://arxiv.org/abs/2506.14957. Code : https://github.com/yuvenduan/POCO. — </w:t>
+      </w:r>
+      <w:r>
+        <w:rPr>
+          <w:i/>
+          <w:iCs/>
+        </w:rPr>
+        <w:t>Présenté au paper reading club du 18 août 2026 ; non lu intégralement.</w:t>
       </w:r>
     </w:p>
     <w:p>
@@ -20863,7 +20742,223 @@
         <w:t>Transfer Learning for Brain–Computer Interfaces: A Euclidean Space Data Alignment Approach.</w:t>
       </w:r>
       <w:r>
-        <w:t xml:space="preserve"> IEEE Transactions on Biomedical Engineering, 67(2), 399–410. (Alignement euclidien, piste proposée par Liz Costato le 2 septembre 2026.)</w:t>
+        <w:t xml:space="preserve"> IEEE Transactions on Biomedical Engineering, 67(2), 399–410. DOI : https://doi.org/10.1109/TBME.2019.2913914. (Alignement euclidien, piste proposée par Liz Costato le 2 septembre 2026.)</w:t>
+      </w:r>
+    </w:p>
+    <w:p>
+      <w:pPr>
+        <w:pStyle w:val="Compact"/>
+        <w:numPr>
+          <w:ilvl w:val="0"/>
+          <w:numId w:val="30"/>
+        </w:numPr>
+      </w:pPr>
+      <w:r>
+        <w:rPr>
+          <w:b/>
+          <w:bCs/>
+        </w:rPr>
+        <w:t>Gramfort, A., Luessi, M., Larson, E., et al.</w:t>
+      </w:r>
+      <w:r>
+        <w:t xml:space="preserve"> (2013). </w:t>
+      </w:r>
+      <w:r>
+        <w:rPr>
+          <w:i/>
+          <w:iCs/>
+        </w:rPr>
+        <w:t>MEG and EEG Data Analysis with MNE-Python.</w:t>
+      </w:r>
+      <w:r>
+        <w:t xml:space="preserve"> Frontiers in Neuroscience, 7, 267. DOI : https://doi.org/10.3389/fnins.2013.00267. (Bibliothèque utilisée pour la conversion et le filtrage des données du laboratoire.)</w:t>
+      </w:r>
+    </w:p>
+    <w:p>
+      <w:pPr>
+        <w:pStyle w:val="Titre2"/>
+      </w:pPr>
+      <w:bookmarkStart w:id="103" w:name="X00c368d35fa9f1dd25d034accff17c81c806c4f"/>
+      <w:bookmarkEnd w:id="102"/>
+      <w:r>
+        <w:t>Documents internes et sources primaires du stage</w:t>
+      </w:r>
+    </w:p>
+    <w:p>
+      <w:pPr>
+        <w:pStyle w:val="Compact"/>
+        <w:numPr>
+          <w:ilvl w:val="0"/>
+          <w:numId w:val="31"/>
+        </w:numPr>
+      </w:pPr>
+      <w:r>
+        <w:rPr>
+          <w:b/>
+          <w:bCs/>
+        </w:rPr>
+        <w:t>Journal de bord du stage</w:t>
+      </w:r>
+      <w:r>
+        <w:t xml:space="preserve">, </w:t>
+      </w:r>
+      <w:r>
+        <w:rPr>
+          <w:rStyle w:val="VerbatimChar"/>
+        </w:rPr>
+        <w:t>notes/JOURNAL.md</w:t>
+      </w:r>
+      <w:r>
+        <w:t xml:space="preserve"> du dépôt </w:t>
+      </w:r>
+      <w:r>
+        <w:rPr>
+          <w:rStyle w:val="VerbatimChar"/>
+        </w:rPr>
+        <w:t>LeBoogiepop/torch-brain-eeg</w:t>
+      </w:r>
+      <w:r>
+        <w:t xml:space="preserve"> (avril → septembre 2026 ; copie de la partie de septembre dans </w:t>
+      </w:r>
+      <w:r>
+        <w:rPr>
+          <w:rStyle w:val="VerbatimChar"/>
+        </w:rPr>
+        <w:t>LeBoogiepop/STEEGFormer</w:t>
+      </w:r>
+      <w:r>
+        <w:t>). Source de vérité pour toutes les dates, configurations et valeurs numériques citées dans les chapitres 5 et 6.</w:t>
+      </w:r>
+    </w:p>
+    <w:p>
+      <w:pPr>
+        <w:pStyle w:val="Compact"/>
+        <w:numPr>
+          <w:ilvl w:val="0"/>
+          <w:numId w:val="31"/>
+        </w:numPr>
+      </w:pPr>
+      <w:r>
+        <w:rPr>
+          <w:b/>
+          <w:bCs/>
+        </w:rPr>
+        <w:t>Fiche de lecture EEG ↔ imagerie calcique</w:t>
+      </w:r>
+      <w:r>
+        <w:t xml:space="preserve">, </w:t>
+      </w:r>
+      <w:r>
+        <w:rPr>
+          <w:rStyle w:val="VerbatimChar"/>
+        </w:rPr>
+        <w:t>notes/papers/README_meeting_2026-08-13.md</w:t>
+      </w:r>
+      <w:r>
+        <w:t>.</w:t>
+      </w:r>
+    </w:p>
+    <w:p>
+      <w:pPr>
+        <w:pStyle w:val="Compact"/>
+        <w:numPr>
+          <w:ilvl w:val="0"/>
+          <w:numId w:val="31"/>
+        </w:numPr>
+      </w:pPr>
+      <w:r>
+        <w:rPr>
+          <w:b/>
+          <w:bCs/>
+        </w:rPr>
+        <w:t>Supports de présentation</w:t>
+      </w:r>
+      <w:r>
+        <w:t xml:space="preserve"> : séminaire de revue (avril), présentation d’article (mai), </w:t>
+      </w:r>
+      <w:r>
+        <w:rPr>
+          <w:i/>
+          <w:iCs/>
+        </w:rPr>
+        <w:t>progress talk</w:t>
+      </w:r>
+      <w:r>
+        <w:t xml:space="preserve"> du 23 juillet, exposé technique du 19 août, point avec Liz Costato du 9 septembre — répertoire </w:t>
+      </w:r>
+      <w:r>
+        <w:rPr>
+          <w:rStyle w:val="VerbatimChar"/>
+        </w:rPr>
+        <w:t>STEEGFormer/presentations/</w:t>
+      </w:r>
+      <w:r>
+        <w:t>.</w:t>
+      </w:r>
+    </w:p>
+    <w:p>
+      <w:pPr>
+        <w:pStyle w:val="Compact"/>
+        <w:numPr>
+          <w:ilvl w:val="0"/>
+          <w:numId w:val="31"/>
+        </w:numPr>
+      </w:pPr>
+      <w:r>
+        <w:rPr>
+          <w:b/>
+          <w:bCs/>
+        </w:rPr>
+        <w:t>Code du stage</w:t>
+      </w:r>
+      <w:r>
+        <w:t xml:space="preserve"> : dépôt https://github.com/LeBoogiepop/STEEGFormer (branche </w:t>
+      </w:r>
+      <w:r>
+        <w:rPr>
+          <w:rStyle w:val="VerbatimChar"/>
+        </w:rPr>
+        <w:t>shared-context</w:t>
+      </w:r>
+      <w:r>
+        <w:t xml:space="preserve">) — </w:t>
+      </w:r>
+      <w:r>
+        <w:rPr>
+          <w:rStyle w:val="VerbatimChar"/>
+        </w:rPr>
+        <w:t>util/prepare_atr_nbp_spatial_attention.py</w:t>
+      </w:r>
+      <w:r>
+        <w:t xml:space="preserve">, </w:t>
+      </w:r>
+      <w:r>
+        <w:rPr>
+          <w:rStyle w:val="VerbatimChar"/>
+        </w:rPr>
+        <w:t>util/dataset_specs_lab_spatial_attention.yaml</w:t>
+      </w:r>
+      <w:r>
+        <w:t xml:space="preserve">, </w:t>
+      </w:r>
+      <w:r>
+        <w:rPr>
+          <w:rStyle w:val="VerbatimChar"/>
+        </w:rPr>
+        <w:lastRenderedPageBreak/>
+        <w:t>scripts/summarize_g2_json_logs.py</w:t>
+      </w:r>
+      <w:r>
+        <w:t xml:space="preserve">, scripts d’orchestration PowerShell et Slurm ; scripts de prétraitement </w:t>
+      </w:r>
+      <w:r>
+        <w:rPr>
+          <w:rStyle w:val="VerbatimChar"/>
+        </w:rPr>
+        <w:t>benchmark/spatial_attention/</w:t>
+      </w:r>
+      <w:r>
+        <w:t xml:space="preserve"> (alignement euclidien, laplacien/CSD, rejet d’artefacts — écrits, non encore exécutés au 10 septembre 2026).</w:t>
       </w:r>
     </w:p>
     <w:p>
@@ -20875,15 +20970,15 @@
       <w:pPr>
         <w:pStyle w:val="Titre1"/>
       </w:pPr>
-      <w:bookmarkStart w:id="103" w:name="annexes"/>
-      <w:bookmarkStart w:id="104" w:name="_Toc239949771"/>
-      <w:bookmarkEnd w:id="102"/>
+      <w:bookmarkStart w:id="104" w:name="annexes"/>
+      <w:bookmarkStart w:id="105" w:name="_Toc239952082"/>
+      <w:bookmarkEnd w:id="103"/>
       <w:bookmarkEnd w:id="94"/>
       <w:r>
         <w:lastRenderedPageBreak/>
         <w:t>Annexes</w:t>
       </w:r>
-      <w:bookmarkEnd w:id="104"/>
+      <w:bookmarkEnd w:id="105"/>
     </w:p>
     <w:p>
       <w:pPr>
@@ -20897,7 +20992,7 @@
       <w:pPr>
         <w:pStyle w:val="Titre2"/>
       </w:pPr>
-      <w:bookmarkStart w:id="105" w:name="annexe-a-glossaire"/>
+      <w:bookmarkStart w:id="106" w:name="annexe-a-glossaire"/>
       <w:r>
         <w:t>Annexe A — Glossaire</w:t>
       </w:r>
@@ -21595,8 +21690,8 @@
       <w:pPr>
         <w:pStyle w:val="Titre2"/>
       </w:pPr>
-      <w:bookmarkStart w:id="106" w:name="Xdf6063c3d2fac7e63fcfaa15f7f668dbe8ad7b0"/>
-      <w:bookmarkEnd w:id="105"/>
+      <w:bookmarkStart w:id="107" w:name="Xdf6063c3d2fac7e63fcfaa15f7f668dbe8ad7b0"/>
+      <w:bookmarkEnd w:id="106"/>
       <w:r>
         <w:t>Annexe B — Configuration retenue (run population et LOSO)</w:t>
       </w:r>
@@ -21779,8 +21874,8 @@
       <w:pPr>
         <w:pStyle w:val="Titre2"/>
       </w:pPr>
-      <w:bookmarkStart w:id="107" w:name="X9bc75ad2e0b0582d587a39d0fec5b9f519fe38b"/>
-      <w:bookmarkEnd w:id="106"/>
+      <w:bookmarkStart w:id="108" w:name="X9bc75ad2e0b0582d587a39d0fec5b9f519fe38b"/>
+      <w:bookmarkEnd w:id="107"/>
       <w:r>
         <w:t>Annexe C — Spécification du jeu de données du laboratoire</w:t>
       </w:r>
@@ -22190,8 +22285,8 @@
       <w:pPr>
         <w:pStyle w:val="Titre2"/>
       </w:pPr>
-      <w:bookmarkStart w:id="108" w:name="X71fcb37696153bcc22971e66579387adc5d4f5c"/>
-      <w:bookmarkEnd w:id="107"/>
+      <w:bookmarkStart w:id="109" w:name="X71fcb37696153bcc22971e66579387adc5d4f5c"/>
+      <w:bookmarkEnd w:id="108"/>
       <w:r>
         <w:t>Annexe D — Chaîne de prétraitement (conversion v2)</w:t>
       </w:r>
@@ -22703,8 +22798,8 @@
       <w:pPr>
         <w:pStyle w:val="Titre2"/>
       </w:pPr>
-      <w:bookmarkStart w:id="109" w:name="X498ff86e125ece83e75b683005cc17db797bf1a"/>
-      <w:bookmarkEnd w:id="108"/>
+      <w:bookmarkStart w:id="110" w:name="X498ff86e125ece83e75b683005cc17db797bf1a"/>
+      <w:bookmarkEnd w:id="109"/>
       <w:r>
         <w:t>Annexe E — Comparaison des deux conversions</w:t>
       </w:r>
@@ -23103,8 +23198,8 @@
       <w:pPr>
         <w:pStyle w:val="Titre2"/>
       </w:pPr>
-      <w:bookmarkStart w:id="110" w:name="Xee2caa79c16688f3e7f17e4db8b80987731ba3a"/>
-      <w:bookmarkEnd w:id="109"/>
+      <w:bookmarkStart w:id="111" w:name="Xee2caa79c16688f3e7f17e4db8b80987731ba3a"/>
+      <w:bookmarkEnd w:id="110"/>
       <w:r>
         <w:t>Annexe F — Résultats bruts cités dans le rapport</w:t>
       </w:r>
@@ -23447,8 +23542,8 @@
       <w:pPr>
         <w:pStyle w:val="Titre2"/>
       </w:pPr>
-      <w:bookmarkStart w:id="111" w:name="X2ee3942f6cc662e5b1cf6d93e2f8a4509c0ba96"/>
-      <w:bookmarkEnd w:id="110"/>
+      <w:bookmarkStart w:id="112" w:name="X2ee3942f6cc662e5b1cf6d93e2f8a4509c0ba96"/>
+      <w:bookmarkEnd w:id="111"/>
       <w:r>
         <w:t>Annexe G — Environnements de calcul utilisés</w:t>
       </w:r>
@@ -23909,8 +24004,8 @@
       <w:pPr>
         <w:pStyle w:val="Titre2"/>
       </w:pPr>
-      <w:bookmarkStart w:id="112" w:name="X993f1584fc33a93181edcd5378193152aba1b05"/>
-      <w:bookmarkEnd w:id="111"/>
+      <w:bookmarkStart w:id="113" w:name="X993f1584fc33a93181edcd5378193152aba1b05"/>
+      <w:bookmarkEnd w:id="112"/>
       <w:r>
         <w:t>Annexe H — Inventaire des contributions logicielles</w:t>
       </w:r>
@@ -23927,10 +24022,7 @@
         <w:t>Code amont</w:t>
       </w:r>
       <w:r>
-        <w:t xml:space="preserve"> </w:t>
-      </w:r>
-      <w:r>
-        <w:t>(dépôt Yang et al., licence MIT) : modèle ViT EEG, pré-entraînement MAE, boucle d’évaluation aval, jeux de spécifications d’origine.</w:t>
+        <w:t xml:space="preserve"> (dépôt Yang et al., licence MIT) : modèle ViT EEG, pré-entraînement MAE, boucle d’évaluation aval, jeux de spécifications d’origine.</w:t>
       </w:r>
     </w:p>
     <w:p>
@@ -23946,276 +24038,6 @@
       </w:r>
       <w:r>
         <w:t xml:space="preserve"> :</w:t>
-      </w:r>
-    </w:p>
-    <w:p>
-      <w:pPr>
-        <w:pStyle w:val="Compact"/>
-        <w:numPr>
-          <w:ilvl w:val="0"/>
-          <w:numId w:val="31"/>
-        </w:numPr>
-      </w:pPr>
-      <w:r>
-        <w:rPr>
-          <w:rStyle w:val="VerbatimChar"/>
-        </w:rPr>
-        <w:t>util/prepare_atr_nbp_spatial_attention.py</w:t>
-      </w:r>
-      <w:r>
-        <w:t xml:space="preserve"> — conversion EEGLAB → format benchmark, avec la chaîne de prétraitement de l’annexe D ;</w:t>
-      </w:r>
-    </w:p>
-    <w:p>
-      <w:pPr>
-        <w:pStyle w:val="Compact"/>
-        <w:numPr>
-          <w:ilvl w:val="0"/>
-          <w:numId w:val="31"/>
-        </w:numPr>
-      </w:pPr>
-      <w:r>
-        <w:rPr>
-          <w:rStyle w:val="VerbatimChar"/>
-        </w:rPr>
-        <w:t>util/prepare_bci_iv2a_moabb.py</w:t>
-      </w:r>
-      <w:r>
-        <w:t xml:space="preserve"> — préparation du jeu public via MOABB, avec reprise et tolérance réseau ;</w:t>
-      </w:r>
-    </w:p>
-    <w:p>
-      <w:pPr>
-        <w:pStyle w:val="Compact"/>
-        <w:numPr>
-          <w:ilvl w:val="0"/>
-          <w:numId w:val="31"/>
-        </w:numPr>
-      </w:pPr>
-      <w:r>
-        <w:rPr>
-          <w:rStyle w:val="VerbatimChar"/>
-        </w:rPr>
-        <w:t>util/dataset_specs_local_bci_iv2a.yaml</w:t>
-      </w:r>
-      <w:r>
-        <w:t xml:space="preserve">, </w:t>
-      </w:r>
-      <w:r>
-        <w:rPr>
-          <w:rStyle w:val="VerbatimChar"/>
-        </w:rPr>
-        <w:t>util/dataset_specs_lab_spatial_attention.yaml</w:t>
-      </w:r>
-      <w:r>
-        <w:t xml:space="preserve"> — chemins et paramètres locaux à la place des chemins HPC ;</w:t>
-      </w:r>
-    </w:p>
-    <w:p>
-      <w:pPr>
-        <w:pStyle w:val="Compact"/>
-        <w:numPr>
-          <w:ilvl w:val="0"/>
-          <w:numId w:val="31"/>
-        </w:numPr>
-      </w:pPr>
-      <w:r>
-        <w:rPr>
-          <w:rStyle w:val="VerbatimChar"/>
-        </w:rPr>
-        <w:t>util/utils.py</w:t>
-      </w:r>
-      <w:r>
-        <w:t xml:space="preserve"> — import optionnel d’une dépendance SSVEP, chargement du mapping de canaux, chargement tolérant du point de contrôle, fonction de coût de classification ;</w:t>
-      </w:r>
-    </w:p>
-    <w:p>
-      <w:pPr>
-        <w:pStyle w:val="Compact"/>
-        <w:numPr>
-          <w:ilvl w:val="0"/>
-          <w:numId w:val="31"/>
-        </w:numPr>
-      </w:pPr>
-      <w:r>
-        <w:rPr>
-          <w:rStyle w:val="VerbatimChar"/>
-        </w:rPr>
-        <w:t>wandb_downstream_evaluation.py</w:t>
-      </w:r>
-      <w:r>
-        <w:t xml:space="preserve"> — option de désactivation du suivi d’expériences, compatibilité CPU/GPU, </w:t>
-      </w:r>
-      <w:r>
-        <w:rPr>
-          <w:b/>
-          <w:bCs/>
-        </w:rPr>
-        <w:t xml:space="preserve">marqueur </w:t>
-      </w:r>
-      <w:r>
-        <w:rPr>
-          <w:rStyle w:val="VerbatimChar"/>
-          <w:b/>
-          <w:bCs/>
-        </w:rPr>
-        <w:t>COMPLETED</w:t>
-      </w:r>
-      <w:r>
-        <w:rPr>
-          <w:b/>
-          <w:bCs/>
-        </w:rPr>
-        <w:t xml:space="preserve"> par pli</w:t>
-      </w:r>
-      <w:r>
-        <w:t xml:space="preserve"> ;</w:t>
-      </w:r>
-    </w:p>
-    <w:p>
-      <w:pPr>
-        <w:pStyle w:val="Compact"/>
-        <w:numPr>
-          <w:ilvl w:val="0"/>
-          <w:numId w:val="31"/>
-        </w:numPr>
-      </w:pPr>
-      <w:r>
-        <w:rPr>
-          <w:rStyle w:val="VerbatimChar"/>
-        </w:rPr>
-        <w:t>wandb_engine_finetune_eeg.py</w:t>
-      </w:r>
-      <w:r>
-        <w:t xml:space="preserve">, </w:t>
-      </w:r>
-      <w:r>
-        <w:rPr>
-          <w:rStyle w:val="VerbatimChar"/>
-        </w:rPr>
-        <w:t>util/misc.py</w:t>
-      </w:r>
-      <w:r>
-        <w:t xml:space="preserve"> — robustesse de journalisation ;</w:t>
-      </w:r>
-    </w:p>
-    <w:p>
-      <w:pPr>
-        <w:pStyle w:val="Compact"/>
-        <w:numPr>
-          <w:ilvl w:val="0"/>
-          <w:numId w:val="31"/>
-        </w:numPr>
-      </w:pPr>
-      <w:r>
-        <w:rPr>
-          <w:rStyle w:val="VerbatimChar"/>
-        </w:rPr>
-        <w:t>scripts/summarize_g2_json_logs.py</w:t>
-      </w:r>
-      <w:r>
-        <w:t xml:space="preserve"> — agrégation hors ligne des journaux JSON ;</w:t>
-      </w:r>
-    </w:p>
-    <w:p>
-      <w:pPr>
-        <w:pStyle w:val="Compact"/>
-        <w:numPr>
-          <w:ilvl w:val="0"/>
-          <w:numId w:val="31"/>
-        </w:numPr>
-      </w:pPr>
-      <w:r>
-        <w:t xml:space="preserve">scripts d’orchestration : </w:t>
-      </w:r>
-      <w:r>
-        <w:rPr>
-          <w:rStyle w:val="VerbatimChar"/>
-        </w:rPr>
-        <w:t>run_g2_*.ps1</w:t>
-      </w:r>
-      <w:r>
-        <w:t xml:space="preserve"> (Windows), </w:t>
-      </w:r>
-      <w:r>
-        <w:rPr>
-          <w:rStyle w:val="VerbatimChar"/>
-        </w:rPr>
-        <w:t>run_loo.sh</w:t>
-      </w:r>
-      <w:r>
-        <w:t xml:space="preserve">, </w:t>
-      </w:r>
-      <w:r>
-        <w:rPr>
-          <w:rStyle w:val="VerbatimChar"/>
-        </w:rPr>
-        <w:t>run_loo.slurm</w:t>
-      </w:r>
-      <w:r>
-        <w:t xml:space="preserve"> (cluster) ;</w:t>
-      </w:r>
-    </w:p>
-    <w:p>
-      <w:pPr>
-        <w:pStyle w:val="Compact"/>
-        <w:numPr>
-          <w:ilvl w:val="0"/>
-          <w:numId w:val="31"/>
-        </w:numPr>
-      </w:pPr>
-      <w:r>
-        <w:rPr>
-          <w:rStyle w:val="VerbatimChar"/>
-        </w:rPr>
-        <w:t>pptx_build/*.js</w:t>
-      </w:r>
-      <w:r>
-        <w:t xml:space="preserve"> — génération scriptée des supports de présentation.</w:t>
-      </w:r>
-    </w:p>
-    <w:p>
-      <w:pPr>
-        <w:pStyle w:val="FirstParagraph"/>
-      </w:pPr>
-      <w:r>
-        <w:rPr>
-          <w:b/>
-          <w:bCs/>
-        </w:rPr>
-        <w:lastRenderedPageBreak/>
-        <w:t>Contribution de ma collègue Liz Costato</w:t>
-      </w:r>
-      <w:r>
-        <w:t>, citée mais non réalisée par moi : pipeline de prétraitement de référence (</w:t>
-      </w:r>
-      <w:r>
-        <w:rPr>
-          <w:rStyle w:val="VerbatimChar"/>
-        </w:rPr>
-        <w:t>set_to_pkl.py</w:t>
-      </w:r>
-      <w:r>
-        <w:t xml:space="preserve"> / </w:t>
-      </w:r>
-      <w:r>
-        <w:rPr>
-          <w:rStyle w:val="VerbatimChar"/>
-        </w:rPr>
-        <w:t>set_to_h5.py</w:t>
-      </w:r>
-      <w:r>
-        <w:t>) et résultats LaBraM.</w:t>
-      </w:r>
-    </w:p>
-    <w:p>
-      <w:pPr>
-        <w:pStyle w:val="Titre2"/>
-      </w:pPr>
-      <w:bookmarkStart w:id="113" w:name="Xc0783b2bf331e21dcf4e07bce137e64c488cba4"/>
-      <w:bookmarkEnd w:id="112"/>
-      <w:r>
-        <w:t>Annexe I — Éléments à compléter avant dépôt</w:t>
       </w:r>
     </w:p>
     <w:p>
@@ -24227,17 +24049,13 @@
         </w:numPr>
       </w:pPr>
       <w:r>
-        <w:t xml:space="preserve">Référence complète de Morioka et al. (2014) et de la revue </w:t>
-      </w:r>
-      <w:r>
-        <w:rPr>
-          <w:i/>
-          <w:iCs/>
-        </w:rPr>
-        <w:t>Critical Review</w:t>
-      </w:r>
-      <w:r>
-        <w:t xml:space="preserve"> (PDF absents de la machine de rédaction).</w:t>
+        <w:rPr>
+          <w:rStyle w:val="VerbatimChar"/>
+        </w:rPr>
+        <w:t>util/prepare_atr_nbp_spatial_attention.py</w:t>
+      </w:r>
+      <w:r>
+        <w:t xml:space="preserve"> — conversion EEGLAB → format benchmark, avec la chaîne de prétraitement de l’annexe D ;</w:t>
       </w:r>
     </w:p>
     <w:p>
@@ -24249,7 +24067,13 @@
         </w:numPr>
       </w:pPr>
       <w:r>
-        <w:t>Canevas de page de garde et logos officiels de l’école, non disponibles sur ce poste.</w:t>
+        <w:rPr>
+          <w:rStyle w:val="VerbatimChar"/>
+        </w:rPr>
+        <w:t>util/prepare_bci_iv2a_moabb.py</w:t>
+      </w:r>
+      <w:r>
+        <w:t xml:space="preserve"> — préparation du jeu public via MOABB, avec reprise et tolérance réseau ;</w:t>
       </w:r>
     </w:p>
     <w:p>
@@ -24261,17 +24085,22 @@
         </w:numPr>
       </w:pPr>
       <w:r>
-        <w:t xml:space="preserve">LOSO agrégé </w:t>
-      </w:r>
-      <w:r>
-        <w:rPr>
-          <w:b/>
-          <w:bCs/>
-        </w:rPr>
-        <w:t>déjà disponible</w:t>
-      </w:r>
-      <w:r>
-        <w:t xml:space="preserve"> (41 plis, 53,55 % ± 3,20 %) — à relire avec Cuong avant dépôt.</w:t>
+        <w:rPr>
+          <w:rStyle w:val="VerbatimChar"/>
+        </w:rPr>
+        <w:t>util/dataset_specs_local_bci_iv2a.yaml</w:t>
+      </w:r>
+      <w:r>
+        <w:t xml:space="preserve">, </w:t>
+      </w:r>
+      <w:r>
+        <w:rPr>
+          <w:rStyle w:val="VerbatimChar"/>
+        </w:rPr>
+        <w:t>util/dataset_specs_lab_spatial_attention.yaml</w:t>
+      </w:r>
+      <w:r>
+        <w:t xml:space="preserve"> — chemins et paramètres locaux à la place des chemins HPC ;</w:t>
       </w:r>
     </w:p>
     <w:p>
@@ -24283,7 +24112,13 @@
         </w:numPr>
       </w:pPr>
       <w:r>
-        <w:t>LDA recalculée sur les 43 sujets, si le temps le permet (coût négligeable).</w:t>
+        <w:rPr>
+          <w:rStyle w:val="VerbatimChar"/>
+        </w:rPr>
+        <w:t>util/utils.py</w:t>
+      </w:r>
+      <w:r>
+        <w:t xml:space="preserve"> — import optionnel d’une dépendance SSVEP, chargement du mapping de canaux, chargement tolérant du point de contrôle, fonction de coût de classification ;</w:t>
       </w:r>
     </w:p>
     <w:p>
@@ -24295,7 +24130,232 @@
         </w:numPr>
       </w:pPr>
       <w:r>
-        <w:t>Figures à produire : schéma comparatif des conversions v1/v2 et courbe d’apprentissage du run population.</w:t>
+        <w:rPr>
+          <w:rStyle w:val="VerbatimChar"/>
+        </w:rPr>
+        <w:t>wandb_downstream_evaluation.py</w:t>
+      </w:r>
+      <w:r>
+        <w:t xml:space="preserve"> — option de désactivation du suivi d’expériences, compatibilité CPU/GPU, </w:t>
+      </w:r>
+      <w:r>
+        <w:rPr>
+          <w:b/>
+          <w:bCs/>
+        </w:rPr>
+        <w:t xml:space="preserve">marqueur </w:t>
+      </w:r>
+      <w:r>
+        <w:rPr>
+          <w:rStyle w:val="VerbatimChar"/>
+          <w:b/>
+          <w:bCs/>
+        </w:rPr>
+        <w:t>COMPLETED</w:t>
+      </w:r>
+      <w:r>
+        <w:rPr>
+          <w:b/>
+          <w:bCs/>
+        </w:rPr>
+        <w:t xml:space="preserve"> par pli</w:t>
+      </w:r>
+      <w:r>
+        <w:t xml:space="preserve"> ;</w:t>
+      </w:r>
+    </w:p>
+    <w:p>
+      <w:pPr>
+        <w:pStyle w:val="Compact"/>
+        <w:numPr>
+          <w:ilvl w:val="0"/>
+          <w:numId w:val="32"/>
+        </w:numPr>
+      </w:pPr>
+      <w:r>
+        <w:rPr>
+          <w:rStyle w:val="VerbatimChar"/>
+        </w:rPr>
+        <w:t>wandb_engine_finetune_eeg.py</w:t>
+      </w:r>
+      <w:r>
+        <w:t xml:space="preserve">, </w:t>
+      </w:r>
+      <w:r>
+        <w:rPr>
+          <w:rStyle w:val="VerbatimChar"/>
+        </w:rPr>
+        <w:t>util/misc.py</w:t>
+      </w:r>
+      <w:r>
+        <w:t xml:space="preserve"> — robustesse de journalisation ;</w:t>
+      </w:r>
+    </w:p>
+    <w:p>
+      <w:pPr>
+        <w:pStyle w:val="Compact"/>
+        <w:numPr>
+          <w:ilvl w:val="0"/>
+          <w:numId w:val="32"/>
+        </w:numPr>
+      </w:pPr>
+      <w:r>
+        <w:rPr>
+          <w:rStyle w:val="VerbatimChar"/>
+        </w:rPr>
+        <w:t>scripts/summarize_g2_json_logs.py</w:t>
+      </w:r>
+      <w:r>
+        <w:t xml:space="preserve"> — agrégation hors ligne des journaux JSON ;</w:t>
+      </w:r>
+    </w:p>
+    <w:p>
+      <w:pPr>
+        <w:pStyle w:val="Compact"/>
+        <w:numPr>
+          <w:ilvl w:val="0"/>
+          <w:numId w:val="32"/>
+        </w:numPr>
+      </w:pPr>
+      <w:r>
+        <w:t xml:space="preserve">scripts d’orchestration : </w:t>
+      </w:r>
+      <w:r>
+        <w:rPr>
+          <w:rStyle w:val="VerbatimChar"/>
+        </w:rPr>
+        <w:t>run_g2_*.ps1</w:t>
+      </w:r>
+      <w:r>
+        <w:t xml:space="preserve"> (Windows), </w:t>
+      </w:r>
+      <w:r>
+        <w:rPr>
+          <w:rStyle w:val="VerbatimChar"/>
+        </w:rPr>
+        <w:t>run_loo.sh</w:t>
+      </w:r>
+      <w:r>
+        <w:t xml:space="preserve">, </w:t>
+      </w:r>
+      <w:r>
+        <w:rPr>
+          <w:rStyle w:val="VerbatimChar"/>
+        </w:rPr>
+        <w:t>run_loo.slurm</w:t>
+      </w:r>
+      <w:r>
+        <w:t xml:space="preserve"> (cluster) ;</w:t>
+      </w:r>
+    </w:p>
+    <w:p>
+      <w:pPr>
+        <w:pStyle w:val="Compact"/>
+        <w:numPr>
+          <w:ilvl w:val="0"/>
+          <w:numId w:val="32"/>
+        </w:numPr>
+      </w:pPr>
+      <w:r>
+        <w:rPr>
+          <w:rStyle w:val="VerbatimChar"/>
+        </w:rPr>
+        <w:t>pptx_build/*.js</w:t>
+      </w:r>
+      <w:r>
+        <w:t xml:space="preserve"> — génération scriptée des supports de présentation.</w:t>
+      </w:r>
+    </w:p>
+    <w:p>
+      <w:pPr>
+        <w:pStyle w:val="FirstParagraph"/>
+      </w:pPr>
+      <w:r>
+        <w:rPr>
+          <w:b/>
+          <w:bCs/>
+        </w:rPr>
+        <w:lastRenderedPageBreak/>
+        <w:t>Contribution de ma collègue Liz Costato</w:t>
+      </w:r>
+      <w:r>
+        <w:t>, citée mais non réalisée par moi : pipeline de prétraitement de référence (</w:t>
+      </w:r>
+      <w:r>
+        <w:rPr>
+          <w:rStyle w:val="VerbatimChar"/>
+        </w:rPr>
+        <w:t>set_to_pkl.py</w:t>
+      </w:r>
+      <w:r>
+        <w:t xml:space="preserve"> / </w:t>
+      </w:r>
+      <w:r>
+        <w:rPr>
+          <w:rStyle w:val="VerbatimChar"/>
+        </w:rPr>
+        <w:t>set_to_h5.py</w:t>
+      </w:r>
+      <w:r>
+        <w:t>) et résultats LaBraM.</w:t>
+      </w:r>
+    </w:p>
+    <w:p>
+      <w:pPr>
+        <w:pStyle w:val="Titre2"/>
+      </w:pPr>
+      <w:bookmarkStart w:id="114" w:name="Xc0783b2bf331e21dcf4e07bce137e64c488cba4"/>
+      <w:bookmarkEnd w:id="113"/>
+      <w:r>
+        <w:t>Annexe I — Éléments à compléter avant dépôt</w:t>
+      </w:r>
+    </w:p>
+    <w:p>
+      <w:pPr>
+        <w:pStyle w:val="Compact"/>
+        <w:numPr>
+          <w:ilvl w:val="0"/>
+          <w:numId w:val="33"/>
+        </w:numPr>
+      </w:pPr>
+      <w:r>
+        <w:t>Canevas de page de garde et logos officiels de l’école, non disponibles sur ce poste.</w:t>
+      </w:r>
+    </w:p>
+    <w:p>
+      <w:pPr>
+        <w:pStyle w:val="Compact"/>
+        <w:numPr>
+          <w:ilvl w:val="0"/>
+          <w:numId w:val="33"/>
+        </w:numPr>
+      </w:pPr>
+      <w:r>
+        <w:t>Visa du laboratoire (Cuong / Ishii-sensei) sur la version finale, exigé par l’école avant dépôt.</w:t>
+      </w:r>
+    </w:p>
+    <w:p>
+      <w:pPr>
+        <w:pStyle w:val="Compact"/>
+        <w:numPr>
+          <w:ilvl w:val="0"/>
+          <w:numId w:val="33"/>
+        </w:numPr>
+      </w:pPr>
+      <w:r>
+        <w:t>LDA recalculée sur les 43 sujets, si le temps le permet (coût négligeable) ; la valeur citée (55,7 %) porte sur 8 sujets.</w:t>
+      </w:r>
+    </w:p>
+    <w:p>
+      <w:pPr>
+        <w:pStyle w:val="Compact"/>
+        <w:numPr>
+          <w:ilvl w:val="0"/>
+          <w:numId w:val="33"/>
+        </w:numPr>
+      </w:pPr>
+      <w:r>
+        <w:t>Figure optionnelle : courbe d’apprentissage du run population (les valeurs sont données en annexe F).</w:t>
       </w:r>
     </w:p>
     <w:p>
@@ -24303,8 +24363,8 @@
         <w:br w:type="page"/>
       </w:r>
     </w:p>
-    <w:bookmarkEnd w:id="113"/>
-    <w:bookmarkEnd w:id="103"/>
+    <w:bookmarkEnd w:id="114"/>
+    <w:bookmarkEnd w:id="104"/>
     <w:sectPr>
       <w:headerReference w:type="default" r:id="rId12"/>
       <w:footerReference w:type="default" r:id="rId13"/>
@@ -24421,7 +24481,7 @@
   <w:abstractNum w:abstractNumId="0" w15:restartNumberingAfterBreak="0">
     <w:nsid w:val="0000A990"/>
     <w:multiLevelType w:val="multilevel"/>
-    <w:tmpl w:val="E3608CA4"/>
+    <w:tmpl w:val="7C1A7318"/>
     <w:lvl w:ilvl="0">
       <w:numFmt w:val="bullet"/>
       <w:lvlText w:val=" "/>
@@ -24498,7 +24558,7 @@
   <w:abstractNum w:abstractNumId="1" w15:restartNumberingAfterBreak="0">
     <w:nsid w:val="0000A991"/>
     <w:multiLevelType w:val="multilevel"/>
-    <w:tmpl w:val="E9D88E16"/>
+    <w:tmpl w:val="417206CC"/>
     <w:lvl w:ilvl="0">
       <w:numFmt w:val="bullet"/>
       <w:lvlText w:val=""/>
@@ -24602,7 +24662,7 @@
   <w:abstractNum w:abstractNumId="2" w15:restartNumberingAfterBreak="0">
     <w:nsid w:val="00A99411"/>
     <w:multiLevelType w:val="multilevel"/>
-    <w:tmpl w:val="0C2673CC"/>
+    <w:tmpl w:val="D6700B7A"/>
     <w:lvl w:ilvl="0">
       <w:start w:val="1"/>
       <w:numFmt w:val="decimal"/>
@@ -24688,7 +24748,7 @@
   <w:abstractNum w:abstractNumId="3" w15:restartNumberingAfterBreak="0">
     <w:nsid w:val="00A99412"/>
     <w:multiLevelType w:val="multilevel"/>
-    <w:tmpl w:val="32F09436"/>
+    <w:tmpl w:val="7D6AC7C6"/>
     <w:lvl w:ilvl="0">
       <w:start w:val="2"/>
       <w:numFmt w:val="decimal"/>
@@ -24774,7 +24834,7 @@
   <w:abstractNum w:abstractNumId="4" w15:restartNumberingAfterBreak="0">
     <w:nsid w:val="00A99418"/>
     <w:multiLevelType w:val="multilevel"/>
-    <w:tmpl w:val="3A9E205C"/>
+    <w:tmpl w:val="F998BE0E"/>
     <w:lvl w:ilvl="0">
       <w:start w:val="8"/>
       <w:numFmt w:val="decimal"/>
@@ -24860,7 +24920,7 @@
   <w:abstractNum w:abstractNumId="5" w15:restartNumberingAfterBreak="0">
     <w:nsid w:val="0A994110"/>
     <w:multiLevelType w:val="multilevel"/>
-    <w:tmpl w:val="37DC3B0C"/>
+    <w:tmpl w:val="3A541808"/>
     <w:lvl w:ilvl="0">
       <w:start w:val="10"/>
       <w:numFmt w:val="decimal"/>
@@ -24944,9 +25004,95 @@
     </w:lvl>
   </w:abstractNum>
   <w:abstractNum w:abstractNumId="6" w15:restartNumberingAfterBreak="0">
+    <w:nsid w:val="0A994119"/>
+    <w:multiLevelType w:val="multilevel"/>
+    <w:tmpl w:val="F27C2E24"/>
+    <w:lvl w:ilvl="0">
+      <w:start w:val="19"/>
+      <w:numFmt w:val="decimal"/>
+      <w:lvlText w:val="%1."/>
+      <w:lvlJc w:val="left"/>
+      <w:pPr>
+        <w:ind w:left="720" w:hanging="360"/>
+      </w:pPr>
+    </w:lvl>
+    <w:lvl w:ilvl="1">
+      <w:start w:val="19"/>
+      <w:numFmt w:val="decimal"/>
+      <w:lvlText w:val="%2."/>
+      <w:lvlJc w:val="left"/>
+      <w:pPr>
+        <w:ind w:left="1440" w:hanging="360"/>
+      </w:pPr>
+    </w:lvl>
+    <w:lvl w:ilvl="2">
+      <w:start w:val="19"/>
+      <w:numFmt w:val="decimal"/>
+      <w:lvlText w:val="%3."/>
+      <w:lvlJc w:val="left"/>
+      <w:pPr>
+        <w:ind w:left="2160" w:hanging="360"/>
+      </w:pPr>
+    </w:lvl>
+    <w:lvl w:ilvl="3">
+      <w:start w:val="19"/>
+      <w:numFmt w:val="decimal"/>
+      <w:lvlText w:val="%4."/>
+      <w:lvlJc w:val="left"/>
+      <w:pPr>
+        <w:ind w:left="2880" w:hanging="360"/>
+      </w:pPr>
+    </w:lvl>
+    <w:lvl w:ilvl="4">
+      <w:start w:val="19"/>
+      <w:numFmt w:val="decimal"/>
+      <w:lvlText w:val="%5."/>
+      <w:lvlJc w:val="left"/>
+      <w:pPr>
+        <w:ind w:left="3600" w:hanging="360"/>
+      </w:pPr>
+    </w:lvl>
+    <w:lvl w:ilvl="5">
+      <w:start w:val="19"/>
+      <w:numFmt w:val="decimal"/>
+      <w:lvlText w:val="%6."/>
+      <w:lvlJc w:val="left"/>
+      <w:pPr>
+        <w:ind w:left="4320" w:hanging="360"/>
+      </w:pPr>
+    </w:lvl>
+    <w:lvl w:ilvl="6">
+      <w:start w:val="19"/>
+      <w:numFmt w:val="decimal"/>
+      <w:lvlText w:val="%7."/>
+      <w:lvlJc w:val="left"/>
+      <w:pPr>
+        <w:ind w:left="5040" w:hanging="360"/>
+      </w:pPr>
+    </w:lvl>
+    <w:lvl w:ilvl="7">
+      <w:start w:val="19"/>
+      <w:numFmt w:val="decimal"/>
+      <w:lvlText w:val="%8."/>
+      <w:lvlJc w:val="left"/>
+      <w:pPr>
+        <w:ind w:left="5760" w:hanging="360"/>
+      </w:pPr>
+    </w:lvl>
+    <w:lvl w:ilvl="8">
+      <w:start w:val="19"/>
+      <w:numFmt w:val="decimal"/>
+      <w:lvlText w:val="%9."/>
+      <w:lvlJc w:val="left"/>
+      <w:pPr>
+        <w:ind w:left="6480" w:hanging="360"/>
+      </w:pPr>
+    </w:lvl>
+  </w:abstractNum>
+  <w:abstractNum w:abstractNumId="7" w15:restartNumberingAfterBreak="0">
     <w:nsid w:val="0A994122"/>
     <w:multiLevelType w:val="multilevel"/>
-    <w:tmpl w:val="5D281E92"/>
+    <w:tmpl w:val="54D4AD08"/>
     <w:lvl w:ilvl="0">
       <w:start w:val="22"/>
       <w:numFmt w:val="decimal"/>
@@ -25029,10 +25175,10 @@
       </w:pPr>
     </w:lvl>
   </w:abstractNum>
-  <w:abstractNum w:abstractNumId="7" w15:restartNumberingAfterBreak="0">
+  <w:abstractNum w:abstractNumId="8" w15:restartNumberingAfterBreak="0">
     <w:nsid w:val="0A994127"/>
     <w:multiLevelType w:val="multilevel"/>
-    <w:tmpl w:val="5DB41CC2"/>
+    <w:tmpl w:val="A5507978"/>
     <w:lvl w:ilvl="0">
       <w:start w:val="27"/>
       <w:numFmt w:val="decimal"/>
@@ -25115,12 +25261,12 @@
       </w:pPr>
     </w:lvl>
   </w:abstractNum>
-  <w:abstractNum w:abstractNumId="8" w15:restartNumberingAfterBreak="0">
-    <w:nsid w:val="0A994131"/>
+  <w:abstractNum w:abstractNumId="9" w15:restartNumberingAfterBreak="0">
+    <w:nsid w:val="0A994129"/>
     <w:multiLevelType w:val="multilevel"/>
-    <w:tmpl w:val="6AEE91DC"/>
+    <w:tmpl w:val="82D0D2D0"/>
     <w:lvl w:ilvl="0">
-      <w:start w:val="31"/>
+      <w:start w:val="29"/>
       <w:numFmt w:val="decimal"/>
       <w:lvlText w:val="%1."/>
       <w:lvlJc w:val="left"/>
@@ -25129,7 +25275,7 @@
       </w:pPr>
     </w:lvl>
     <w:lvl w:ilvl="1">
-      <w:start w:val="31"/>
+      <w:start w:val="29"/>
       <w:numFmt w:val="decimal"/>
       <w:lvlText w:val="%2."/>
       <w:lvlJc w:val="left"/>
@@ -25138,7 +25284,7 @@
       </w:pPr>
     </w:lvl>
     <w:lvl w:ilvl="2">
-      <w:start w:val="31"/>
+      <w:start w:val="29"/>
       <w:numFmt w:val="decimal"/>
       <w:lvlText w:val="%3."/>
       <w:lvlJc w:val="left"/>
@@ -25147,7 +25293,7 @@
       </w:pPr>
     </w:lvl>
     <w:lvl w:ilvl="3">
-      <w:start w:val="31"/>
+      <w:start w:val="29"/>
       <w:numFmt w:val="decimal"/>
       <w:lvlText w:val="%4."/>
       <w:lvlJc w:val="left"/>
@@ -25156,7 +25302,7 @@
       </w:pPr>
     </w:lvl>
     <w:lvl w:ilvl="4">
-      <w:start w:val="31"/>
+      <w:start w:val="29"/>
       <w:numFmt w:val="decimal"/>
       <w:lvlText w:val="%5."/>
       <w:lvlJc w:val="left"/>
@@ -25165,7 +25311,7 @@
       </w:pPr>
     </w:lvl>
     <w:lvl w:ilvl="5">
-      <w:start w:val="31"/>
+      <w:start w:val="29"/>
       <w:numFmt w:val="decimal"/>
       <w:lvlText w:val="%6."/>
       <w:lvlJc w:val="left"/>
@@ -25174,7 +25320,7 @@
       </w:pPr>
     </w:lvl>
     <w:lvl w:ilvl="6">
-      <w:start w:val="31"/>
+      <w:start w:val="29"/>
       <w:numFmt w:val="decimal"/>
       <w:lvlText w:val="%7."/>
       <w:lvlJc w:val="left"/>
@@ -25183,7 +25329,7 @@
       </w:pPr>
     </w:lvl>
     <w:lvl w:ilvl="7">
-      <w:start w:val="31"/>
+      <w:start w:val="29"/>
       <w:numFmt w:val="decimal"/>
       <w:lvlText w:val="%8."/>
       <w:lvlJc w:val="left"/>
@@ -25192,7 +25338,7 @@
       </w:pPr>
     </w:lvl>
     <w:lvl w:ilvl="8">
-      <w:start w:val="31"/>
+      <w:start w:val="29"/>
       <w:numFmt w:val="decimal"/>
       <w:lvlText w:val="%9."/>
       <w:lvlJc w:val="left"/>
@@ -25201,10 +25347,10 @@
       </w:pPr>
     </w:lvl>
   </w:abstractNum>
-  <w:num w:numId="1" w16cid:durableId="516384190">
+  <w:num w:numId="1" w16cid:durableId="1376198162">
     <w:abstractNumId w:val="0"/>
   </w:num>
-  <w:num w:numId="2" w16cid:durableId="1455631667">
+  <w:num w:numId="2" w16cid:durableId="55513509">
     <w:abstractNumId w:val="2"/>
     <w:lvlOverride w:ilvl="0">
       <w:startOverride w:val="1"/>
@@ -25234,19 +25380,19 @@
       <w:startOverride w:val="1"/>
     </w:lvlOverride>
   </w:num>
-  <w:num w:numId="3" w16cid:durableId="1909998078">
+  <w:num w:numId="3" w16cid:durableId="2035421347">
     <w:abstractNumId w:val="1"/>
   </w:num>
-  <w:num w:numId="4" w16cid:durableId="303199436">
+  <w:num w:numId="4" w16cid:durableId="389960865">
     <w:abstractNumId w:val="1"/>
   </w:num>
-  <w:num w:numId="5" w16cid:durableId="884608254">
+  <w:num w:numId="5" w16cid:durableId="1499731408">
     <w:abstractNumId w:val="1"/>
   </w:num>
-  <w:num w:numId="6" w16cid:durableId="389694964">
+  <w:num w:numId="6" w16cid:durableId="970942156">
     <w:abstractNumId w:val="1"/>
   </w:num>
-  <w:num w:numId="7" w16cid:durableId="628896884">
+  <w:num w:numId="7" w16cid:durableId="1824733012">
     <w:abstractNumId w:val="2"/>
     <w:lvlOverride w:ilvl="0">
       <w:startOverride w:val="1"/>
@@ -25276,13 +25422,13 @@
       <w:startOverride w:val="1"/>
     </w:lvlOverride>
   </w:num>
-  <w:num w:numId="8" w16cid:durableId="1019045392">
+  <w:num w:numId="8" w16cid:durableId="1068186260">
     <w:abstractNumId w:val="1"/>
   </w:num>
-  <w:num w:numId="9" w16cid:durableId="979115903">
+  <w:num w:numId="9" w16cid:durableId="775101492">
     <w:abstractNumId w:val="1"/>
   </w:num>
-  <w:num w:numId="10" w16cid:durableId="2102027064">
+  <w:num w:numId="10" w16cid:durableId="1266688360">
     <w:abstractNumId w:val="2"/>
     <w:lvlOverride w:ilvl="0">
       <w:startOverride w:val="1"/>
@@ -25312,7 +25458,7 @@
       <w:startOverride w:val="1"/>
     </w:lvlOverride>
   </w:num>
-  <w:num w:numId="11" w16cid:durableId="810289092">
+  <w:num w:numId="11" w16cid:durableId="912861804">
     <w:abstractNumId w:val="2"/>
     <w:lvlOverride w:ilvl="0">
       <w:startOverride w:val="1"/>
@@ -25342,7 +25488,7 @@
       <w:startOverride w:val="1"/>
     </w:lvlOverride>
   </w:num>
-  <w:num w:numId="12" w16cid:durableId="143356961">
+  <w:num w:numId="12" w16cid:durableId="246229057">
     <w:abstractNumId w:val="2"/>
     <w:lvlOverride w:ilvl="0">
       <w:startOverride w:val="1"/>
@@ -25372,10 +25518,10 @@
       <w:startOverride w:val="1"/>
     </w:lvlOverride>
   </w:num>
-  <w:num w:numId="13" w16cid:durableId="603265717">
+  <w:num w:numId="13" w16cid:durableId="2007318636">
     <w:abstractNumId w:val="1"/>
   </w:num>
-  <w:num w:numId="14" w16cid:durableId="415521466">
+  <w:num w:numId="14" w16cid:durableId="870072014">
     <w:abstractNumId w:val="2"/>
     <w:lvlOverride w:ilvl="0">
       <w:startOverride w:val="1"/>
@@ -25405,19 +25551,19 @@
       <w:startOverride w:val="1"/>
     </w:lvlOverride>
   </w:num>
-  <w:num w:numId="15" w16cid:durableId="779492077">
+  <w:num w:numId="15" w16cid:durableId="1999535440">
     <w:abstractNumId w:val="1"/>
   </w:num>
-  <w:num w:numId="16" w16cid:durableId="1701467409">
+  <w:num w:numId="16" w16cid:durableId="282083490">
     <w:abstractNumId w:val="1"/>
   </w:num>
-  <w:num w:numId="17" w16cid:durableId="322201758">
+  <w:num w:numId="17" w16cid:durableId="725031610">
     <w:abstractNumId w:val="1"/>
   </w:num>
-  <w:num w:numId="18" w16cid:durableId="360857737">
+  <w:num w:numId="18" w16cid:durableId="1041900726">
     <w:abstractNumId w:val="1"/>
   </w:num>
-  <w:num w:numId="19" w16cid:durableId="968515266">
+  <w:num w:numId="19" w16cid:durableId="1688941737">
     <w:abstractNumId w:val="2"/>
     <w:lvlOverride w:ilvl="0">
       <w:startOverride w:val="1"/>
@@ -25447,19 +25593,19 @@
       <w:startOverride w:val="1"/>
     </w:lvlOverride>
   </w:num>
-  <w:num w:numId="20" w16cid:durableId="1545098087">
+  <w:num w:numId="20" w16cid:durableId="1241142010">
     <w:abstractNumId w:val="1"/>
   </w:num>
-  <w:num w:numId="21" w16cid:durableId="516235709">
+  <w:num w:numId="21" w16cid:durableId="252248721">
     <w:abstractNumId w:val="1"/>
   </w:num>
-  <w:num w:numId="22" w16cid:durableId="1029911684">
+  <w:num w:numId="22" w16cid:durableId="1768383544">
     <w:abstractNumId w:val="1"/>
   </w:num>
-  <w:num w:numId="23" w16cid:durableId="1851523542">
+  <w:num w:numId="23" w16cid:durableId="192960857">
     <w:abstractNumId w:val="1"/>
   </w:num>
-  <w:num w:numId="24" w16cid:durableId="1079867794">
+  <w:num w:numId="24" w16cid:durableId="1059595904">
     <w:abstractNumId w:val="2"/>
     <w:lvlOverride w:ilvl="0">
       <w:startOverride w:val="1"/>
@@ -25489,7 +25635,7 @@
       <w:startOverride w:val="1"/>
     </w:lvlOverride>
   </w:num>
-  <w:num w:numId="25" w16cid:durableId="872572685">
+  <w:num w:numId="25" w16cid:durableId="626088960">
     <w:abstractNumId w:val="3"/>
     <w:lvlOverride w:ilvl="0">
       <w:startOverride w:val="2"/>
@@ -25519,7 +25665,7 @@
       <w:startOverride w:val="2"/>
     </w:lvlOverride>
   </w:num>
-  <w:num w:numId="26" w16cid:durableId="1981571256">
+  <w:num w:numId="26" w16cid:durableId="691761974">
     <w:abstractNumId w:val="4"/>
     <w:lvlOverride w:ilvl="0">
       <w:startOverride w:val="8"/>
@@ -25549,7 +25695,7 @@
       <w:startOverride w:val="8"/>
     </w:lvlOverride>
   </w:num>
-  <w:num w:numId="27" w16cid:durableId="1835679763">
+  <w:num w:numId="27" w16cid:durableId="1378237337">
     <w:abstractNumId w:val="5"/>
     <w:lvlOverride w:ilvl="0">
       <w:startOverride w:val="10"/>
@@ -25579,8 +25725,38 @@
       <w:startOverride w:val="10"/>
     </w:lvlOverride>
   </w:num>
-  <w:num w:numId="28" w16cid:durableId="376440694">
+  <w:num w:numId="28" w16cid:durableId="99105374">
     <w:abstractNumId w:val="6"/>
+    <w:lvlOverride w:ilvl="0">
+      <w:startOverride w:val="19"/>
+    </w:lvlOverride>
+    <w:lvlOverride w:ilvl="1">
+      <w:startOverride w:val="19"/>
+    </w:lvlOverride>
+    <w:lvlOverride w:ilvl="2">
+      <w:startOverride w:val="19"/>
+    </w:lvlOverride>
+    <w:lvlOverride w:ilvl="3">
+      <w:startOverride w:val="19"/>
+    </w:lvlOverride>
+    <w:lvlOverride w:ilvl="4">
+      <w:startOverride w:val="19"/>
+    </w:lvlOverride>
+    <w:lvlOverride w:ilvl="5">
+      <w:startOverride w:val="19"/>
+    </w:lvlOverride>
+    <w:lvlOverride w:ilvl="6">
+      <w:startOverride w:val="19"/>
+    </w:lvlOverride>
+    <w:lvlOverride w:ilvl="7">
+      <w:startOverride w:val="19"/>
+    </w:lvlOverride>
+    <w:lvlOverride w:ilvl="8">
+      <w:startOverride w:val="19"/>
+    </w:lvlOverride>
+  </w:num>
+  <w:num w:numId="29" w16cid:durableId="460806792">
+    <w:abstractNumId w:val="7"/>
     <w:lvlOverride w:ilvl="0">
       <w:startOverride w:val="22"/>
     </w:lvlOverride>
@@ -25609,8 +25785,8 @@
       <w:startOverride w:val="22"/>
     </w:lvlOverride>
   </w:num>
-  <w:num w:numId="29" w16cid:durableId="1934438441">
-    <w:abstractNumId w:val="7"/>
+  <w:num w:numId="30" w16cid:durableId="1732726859">
+    <w:abstractNumId w:val="8"/>
     <w:lvlOverride w:ilvl="0">
       <w:startOverride w:val="27"/>
     </w:lvlOverride>
@@ -25639,40 +25815,40 @@
       <w:startOverride w:val="27"/>
     </w:lvlOverride>
   </w:num>
-  <w:num w:numId="30" w16cid:durableId="1804077674">
-    <w:abstractNumId w:val="8"/>
+  <w:num w:numId="31" w16cid:durableId="1612786700">
+    <w:abstractNumId w:val="9"/>
     <w:lvlOverride w:ilvl="0">
-      <w:startOverride w:val="31"/>
+      <w:startOverride w:val="29"/>
     </w:lvlOverride>
     <w:lvlOverride w:ilvl="1">
-      <w:startOverride w:val="31"/>
+      <w:startOverride w:val="29"/>
     </w:lvlOverride>
     <w:lvlOverride w:ilvl="2">
-      <w:startOverride w:val="31"/>
+      <w:startOverride w:val="29"/>
     </w:lvlOverride>
     <w:lvlOverride w:ilvl="3">
-      <w:startOverride w:val="31"/>
+      <w:startOverride w:val="29"/>
     </w:lvlOverride>
     <w:lvlOverride w:ilvl="4">
-      <w:startOverride w:val="31"/>
+      <w:startOverride w:val="29"/>
     </w:lvlOverride>
     <w:lvlOverride w:ilvl="5">
-      <w:startOverride w:val="31"/>
+      <w:startOverride w:val="29"/>
     </w:lvlOverride>
     <w:lvlOverride w:ilvl="6">
-      <w:startOverride w:val="31"/>
+      <w:startOverride w:val="29"/>
     </w:lvlOverride>
     <w:lvlOverride w:ilvl="7">
-      <w:startOverride w:val="31"/>
+      <w:startOverride w:val="29"/>
     </w:lvlOverride>
     <w:lvlOverride w:ilvl="8">
-      <w:startOverride w:val="31"/>
+      <w:startOverride w:val="29"/>
     </w:lvlOverride>
   </w:num>
-  <w:num w:numId="31" w16cid:durableId="1170678712">
+  <w:num w:numId="32" w16cid:durableId="382867726">
     <w:abstractNumId w:val="1"/>
   </w:num>
-  <w:num w:numId="32" w16cid:durableId="76947399">
+  <w:num w:numId="33" w16cid:durableId="793793250">
     <w:abstractNumId w:val="1"/>
   </w:num>
 </w:numbering>
@@ -26900,7 +27076,7 @@
     <w:next w:val="Normal"/>
     <w:autoRedefine/>
     <w:uiPriority w:val="39"/>
-    <w:rsid w:val="00440BED"/>
+    <w:rsid w:val="009C61E9"/>
     <w:pPr>
       <w:spacing w:after="100"/>
     </w:pPr>

</xml_diff>